<commit_message>
Updates to Gold Notebooks
</commit_message>
<xml_diff>
--- a/docs/Task 2/DCook_D502_Task_2_v1.docx
+++ b/docs/Task 2/DCook_D502_Task_2_v1.docx
@@ -140,16 +140,14 @@
         </w:rPr>
         <w:t xml:space="preserve">Early-Warning Predictive </w:t>
       </w:r>
-      <w:proofErr w:type="spellStart"/>
       <w:r>
         <w:rPr>
           <w:color w:val="000000"/>
           <w:sz w:val="24"/>
           <w:szCs w:val="24"/>
         </w:rPr>
-        <w:t>Maintenace</w:t>
-      </w:r>
-      <w:proofErr w:type="spellEnd"/>
+        <w:t>Maintenance</w:t>
+      </w:r>
       <w:r>
         <w:rPr>
           <w:color w:val="000000"/>
@@ -2620,57 +2618,228 @@
     </w:p>
     <w:p>
       <w:pPr>
+        <w:pStyle w:val="Heading3"/>
+        <w:spacing w:line="360" w:lineRule="auto"/>
+        <w:rPr>
+          <w:sz w:val="24"/>
+          <w:szCs w:val="24"/>
+        </w:rPr>
+      </w:pPr>
+      <w:bookmarkStart w:id="7" w:name="_Toc694593955"/>
+      <w:r>
+        <w:rPr>
+          <w:sz w:val="24"/>
+          <w:szCs w:val="24"/>
+        </w:rPr>
+        <w:t xml:space="preserve">Review of </w:t>
+      </w:r>
+      <w:r>
+        <w:rPr>
+          <w:sz w:val="24"/>
+          <w:szCs w:val="24"/>
+        </w:rPr>
+        <w:t>Work</w:t>
+      </w:r>
+      <w:r>
+        <w:rPr>
+          <w:sz w:val="24"/>
+          <w:szCs w:val="24"/>
+        </w:rPr>
+        <w:t xml:space="preserve"> 1</w:t>
+      </w:r>
+      <w:bookmarkEnd w:id="7"/>
+    </w:p>
+    <w:p>
+      <w:pPr>
+        <w:spacing w:line="360" w:lineRule="auto"/>
+        <w:rPr>
+          <w:sz w:val="24"/>
+          <w:szCs w:val="24"/>
+        </w:rPr>
+      </w:pPr>
+      <w:r>
+        <w:rPr>
+          <w:sz w:val="24"/>
+          <w:szCs w:val="24"/>
+        </w:rPr>
+        <w:t>Fast Anomaly Detection for Vision-Based Industrial Inspection Using Cascades of Null Subspace PCA Detectors (PMC12349016)</w:t>
+      </w:r>
+    </w:p>
+    <w:p>
+      <w:pPr>
         <w:spacing w:line="360" w:lineRule="auto"/>
         <w:ind w:firstLine="720"/>
         <w:rPr>
-          <w:color w:val="00B050"/>
-          <w:sz w:val="24"/>
-          <w:szCs w:val="24"/>
-        </w:rPr>
-      </w:pPr>
-      <w:r>
-        <w:rPr>
-          <w:b/>
-          <w:bCs/>
-          <w:color w:val="00B050"/>
-          <w:sz w:val="24"/>
-          <w:szCs w:val="24"/>
-        </w:rPr>
-        <w:t>Rubric A3:</w:t>
-      </w:r>
-      <w:r>
-        <w:rPr>
-          <w:color w:val="00B050"/>
+          <w:sz w:val="24"/>
+          <w:szCs w:val="24"/>
+        </w:rPr>
+      </w:pPr>
+    </w:p>
+    <w:p>
+      <w:pPr>
+        <w:spacing w:line="360" w:lineRule="auto"/>
+        <w:rPr>
+          <w:sz w:val="24"/>
+          <w:szCs w:val="24"/>
+        </w:rPr>
+      </w:pPr>
+      <w:r>
+        <w:rPr>
+          <w:sz w:val="24"/>
+          <w:szCs w:val="24"/>
+        </w:rPr>
+        <w:t>This published study investigates how anomaly detection can be made more effective in industrial inspection settings where rapid and accurate identification of defects is required. The authors observe that while many existing deep learning approaches have been successful in achieving high accuracy, they are often associated with computationally intensive models that are not very useful in practical scenarios. To overcome this limitation, the authors introduce a light-weight anomaly detection solution that leverages the strengths of a compact backbone model and a multi-stage cascade of detectors based on null-space principal component analysis (PCA). The proposed solution is more sensitive to anomalies by targeting the low-variance subspace of normal data, thus eliminating the need for computationally intensive reconstruction-based or distance-based approaches.</w:t>
+      </w:r>
+    </w:p>
+    <w:p>
+      <w:pPr>
+        <w:spacing w:line="360" w:lineRule="auto"/>
+        <w:rPr>
+          <w:sz w:val="24"/>
+          <w:szCs w:val="24"/>
+        </w:rPr>
+      </w:pPr>
+    </w:p>
+    <w:p>
+      <w:pPr>
+        <w:spacing w:line="360" w:lineRule="auto"/>
+        <w:rPr>
+          <w:sz w:val="24"/>
+          <w:szCs w:val="24"/>
+        </w:rPr>
+      </w:pPr>
+      <w:r>
+        <w:rPr>
+          <w:sz w:val="24"/>
+          <w:szCs w:val="24"/>
+        </w:rPr>
+        <w:t>One of the major strengths of this study is the introduction of a cascade architecture that filters out obvious normal cases in the early stages and applies increasingly specific checks in the latter stages. This approach helps to minimize false positives and computational requirements while still maintaining high levels of anomaly detection accuracy. The authors have demonstrated the effectiveness of the proposed cascade architecture on standard industrial datasets, which outperforms or matches the performance of more computationally intensive CNN-based models while being much more efficient.</w:t>
+      </w:r>
+    </w:p>
+    <w:p>
+      <w:pPr>
+        <w:spacing w:line="360" w:lineRule="auto"/>
+        <w:ind w:firstLine="720"/>
+        <w:rPr>
+          <w:sz w:val="24"/>
+          <w:szCs w:val="24"/>
+        </w:rPr>
+      </w:pPr>
+    </w:p>
+    <w:p>
+      <w:pPr>
+        <w:pStyle w:val="Heading4"/>
+      </w:pPr>
+      <w:r>
+        <w:t>Relation to This Project:</w:t>
+      </w:r>
+    </w:p>
+    <w:p>
+      <w:pPr>
+        <w:spacing w:line="360" w:lineRule="auto"/>
+        <w:rPr>
+          <w:sz w:val="24"/>
+          <w:szCs w:val="24"/>
+        </w:rPr>
+      </w:pPr>
+    </w:p>
+    <w:p>
+      <w:pPr>
+        <w:spacing w:line="360" w:lineRule="auto"/>
+      </w:pPr>
+      <w:r>
+        <w:rPr>
+          <w:sz w:val="24"/>
+          <w:szCs w:val="24"/>
+        </w:rPr>
+        <w:t xml:space="preserve">This study supports the relevance of comparing a single broad anomaly detection model with a multi-stage cascade of detectors. The results validate the idea that a cascade can help reduce unnecessary alerts, improve screening accuracy, and operate efficiently in industrial </w:t>
+      </w:r>
+      <w:r>
+        <w:rPr>
+          <w:sz w:val="24"/>
+          <w:szCs w:val="24"/>
+        </w:rPr>
+        <w:lastRenderedPageBreak/>
+        <w:t>environments with limited resources. This aligns directly with the project’s goal of evaluating whether a three-stage cascade built from Isolation Forest models and rule-based confirmation can generate more useful early warning alerts than a single unsupervised baseline model.</w:t>
+      </w:r>
+      <w:r>
+        <w:rPr>
           <w:sz w:val="24"/>
           <w:szCs w:val="24"/>
         </w:rPr>
         <w:t xml:space="preserve"> </w:t>
       </w:r>
-      <w:r>
-        <w:rPr>
-          <w:color w:val="00B050"/>
-          <w:sz w:val="24"/>
-          <w:szCs w:val="24"/>
-        </w:rPr>
-        <w:t>An accurate summary of 3 different published works that relate to the research question or organizational need in part A1 is provided, and the summary of </w:t>
-      </w:r>
-      <w:r>
-        <w:rPr>
-          <w:i/>
-          <w:iCs/>
-          <w:color w:val="00B050"/>
-          <w:sz w:val="24"/>
-          <w:szCs w:val="24"/>
-        </w:rPr>
-        <w:t>each</w:t>
-      </w:r>
-      <w:r>
-        <w:rPr>
-          <w:color w:val="00B050"/>
-          <w:sz w:val="24"/>
-          <w:szCs w:val="24"/>
-        </w:rPr>
-        <w:t> work includes essential details.</w:t>
+    </w:p>
+    <w:p>
+      <w:pPr>
+        <w:pStyle w:val="Heading3"/>
+        <w:spacing w:line="360" w:lineRule="auto"/>
+        <w:rPr>
+          <w:sz w:val="24"/>
+          <w:szCs w:val="24"/>
+        </w:rPr>
+      </w:pPr>
+      <w:bookmarkStart w:id="8" w:name="_Toc475195288"/>
+      <w:r>
+        <w:rPr>
+          <w:sz w:val="24"/>
+          <w:szCs w:val="24"/>
+        </w:rPr>
+        <w:t xml:space="preserve">Review of </w:t>
+      </w:r>
+      <w:r>
+        <w:rPr>
+          <w:sz w:val="24"/>
+          <w:szCs w:val="24"/>
+        </w:rPr>
+        <w:t>Work</w:t>
+      </w:r>
+      <w:r>
+        <w:rPr>
+          <w:sz w:val="24"/>
+          <w:szCs w:val="24"/>
+        </w:rPr>
+        <w:t xml:space="preserve"> </w:t>
+      </w:r>
+      <w:r>
+        <w:rPr>
+          <w:sz w:val="24"/>
+          <w:szCs w:val="24"/>
+        </w:rPr>
+        <w:t>2</w:t>
+      </w:r>
+      <w:bookmarkEnd w:id="8"/>
+    </w:p>
+    <w:p>
+      <w:pPr>
+        <w:spacing w:line="360" w:lineRule="auto"/>
+        <w:rPr>
+          <w:sz w:val="24"/>
+          <w:szCs w:val="24"/>
+        </w:rPr>
+      </w:pPr>
+      <w:r>
+        <w:rPr>
+          <w:sz w:val="24"/>
+          <w:szCs w:val="24"/>
+        </w:rPr>
+        <w:t xml:space="preserve">Adaptable and Unsupervised </w:t>
+      </w:r>
+      <w:proofErr w:type="spellStart"/>
+      <w:r>
+        <w:rPr>
+          <w:sz w:val="24"/>
+          <w:szCs w:val="24"/>
+        </w:rPr>
+        <w:t>TinyML</w:t>
+      </w:r>
+      <w:proofErr w:type="spellEnd"/>
+      <w:r>
+        <w:rPr>
+          <w:sz w:val="24"/>
+          <w:szCs w:val="24"/>
+        </w:rPr>
+        <w:t xml:space="preserve"> Anomaly Detection System for Extreme Industrial Environments (PMID 36850940)</w:t>
       </w:r>
     </w:p>
     <w:p>
@@ -2682,29 +2851,31 @@
           <w:szCs w:val="24"/>
         </w:rPr>
       </w:pPr>
-      <w:r>
-        <w:rPr>
-          <w:sz w:val="24"/>
-          <w:szCs w:val="24"/>
-        </w:rPr>
-        <w:t xml:space="preserve">Any citable work produced by an industry or academic professional is acceptable, e.g., </w:t>
-      </w:r>
-      <w:proofErr w:type="gramStart"/>
-      <w:r>
-        <w:rPr>
-          <w:sz w:val="24"/>
-          <w:szCs w:val="24"/>
-        </w:rPr>
-        <w:t>whitepaper</w:t>
-      </w:r>
-      <w:proofErr w:type="gramEnd"/>
-      <w:r>
-        <w:rPr>
-          <w:sz w:val="24"/>
-          <w:szCs w:val="24"/>
-        </w:rPr>
-        <w:t>, online articles, manuals, videos, etc</w:t>
-      </w:r>
+    </w:p>
+    <w:p>
+      <w:pPr>
+        <w:spacing w:line="360" w:lineRule="auto"/>
+        <w:rPr>
+          <w:sz w:val="24"/>
+          <w:szCs w:val="24"/>
+        </w:rPr>
+      </w:pPr>
+      <w:r>
+        <w:rPr>
+          <w:sz w:val="24"/>
+          <w:szCs w:val="24"/>
+        </w:rPr>
+        <w:t xml:space="preserve">This research proposes an unlabeled, unsupervised anomaly detection system specifically for extreme industrial environments, where typical cloud-based systems are inefficient due to connectivity issues and harsh environmental conditions. The authors highlight that typical industrial monitoring systems currently depend on external servers for data analysis from sensors, which introduces complexity and risks associated with network connectivity issues. To address these issues, the authors develop an end-to-end system that operates fully at the edge of the network using a low-power Internet of Things (IoT) device based on </w:t>
+      </w:r>
+      <w:proofErr w:type="spellStart"/>
+      <w:r>
+        <w:rPr>
+          <w:sz w:val="24"/>
+          <w:szCs w:val="24"/>
+        </w:rPr>
+        <w:t>TinyML</w:t>
+      </w:r>
+      <w:proofErr w:type="spellEnd"/>
       <w:r>
         <w:rPr>
           <w:sz w:val="24"/>
@@ -2715,34 +2886,231 @@
     </w:p>
     <w:p>
       <w:pPr>
-        <w:pBdr>
-          <w:top w:val="nil"/>
-          <w:left w:val="nil"/>
-          <w:bottom w:val="nil"/>
-          <w:right w:val="nil"/>
-          <w:between w:val="nil"/>
-        </w:pBdr>
         <w:spacing w:line="360" w:lineRule="auto"/>
         <w:ind w:firstLine="720"/>
         <w:rPr>
-          <w:color w:val="00B050"/>
-          <w:sz w:val="24"/>
-          <w:szCs w:val="24"/>
-        </w:rPr>
-      </w:pPr>
-      <w:r>
-        <w:rPr>
-          <w:b/>
-          <w:bCs/>
-          <w:color w:val="00B050"/>
-          <w:sz w:val="24"/>
-          <w:szCs w:val="24"/>
-        </w:rPr>
-        <w:t>Rubric A3A:</w:t>
-      </w:r>
-      <w:r>
-        <w:rPr>
-          <w:color w:val="00B050"/>
+          <w:sz w:val="24"/>
+          <w:szCs w:val="24"/>
+        </w:rPr>
+      </w:pPr>
+    </w:p>
+    <w:p>
+      <w:pPr>
+        <w:spacing w:line="360" w:lineRule="auto"/>
+        <w:rPr>
+          <w:sz w:val="24"/>
+          <w:szCs w:val="24"/>
+        </w:rPr>
+      </w:pPr>
+      <w:r>
+        <w:rPr>
+          <w:sz w:val="24"/>
+          <w:szCs w:val="24"/>
+        </w:rPr>
+        <w:t xml:space="preserve">At the heart of this system, the authors develop an Isolation Forest model that is trained directly on the IoT device (an ESP32 microcontroller) to identify anomalies in real time. The system can be trained in as little as 1.2–6.4 seconds and make inference decisions in under 16 </w:t>
+      </w:r>
+      <w:proofErr w:type="spellStart"/>
+      <w:r>
+        <w:rPr>
+          <w:sz w:val="24"/>
+          <w:szCs w:val="24"/>
+        </w:rPr>
+        <w:t>ms</w:t>
+      </w:r>
+      <w:proofErr w:type="spellEnd"/>
+      <w:r>
+        <w:rPr>
+          <w:sz w:val="24"/>
+          <w:szCs w:val="24"/>
+        </w:rPr>
+        <w:t xml:space="preserve"> with a low RAM footprint, making it suitable for resource-limited industrial equipment. In addition, the study incorporates blockchain technology to provide transparent and immutable logging of detected anomalies.</w:t>
+      </w:r>
+    </w:p>
+    <w:p>
+      <w:pPr>
+        <w:spacing w:line="360" w:lineRule="auto"/>
+        <w:rPr>
+          <w:sz w:val="24"/>
+          <w:szCs w:val="24"/>
+        </w:rPr>
+      </w:pPr>
+    </w:p>
+    <w:p>
+      <w:pPr>
+        <w:pStyle w:val="Heading4"/>
+      </w:pPr>
+      <w:r>
+        <w:t>Relation to This Project:</w:t>
+      </w:r>
+    </w:p>
+    <w:p/>
+    <w:p>
+      <w:pPr>
+        <w:spacing w:line="360" w:lineRule="auto"/>
+        <w:rPr>
+          <w:sz w:val="24"/>
+          <w:szCs w:val="24"/>
+        </w:rPr>
+      </w:pPr>
+      <w:r>
+        <w:rPr>
+          <w:sz w:val="24"/>
+          <w:szCs w:val="24"/>
+        </w:rPr>
+        <w:t>This reference is highly relevant to the project’s focus on unsupervised anomaly detection for industrial assets, particularly in scenarios where computational resources and connectivity are limited. It supports the use of the Isolation Forest model as a baseline anomaly detector and reinforces the value of real-time anomaly processing at the edge for pump sensor data. The emphasis on lightweight models and rapid classification provides practical context for building efficient unsupervised detectors and comparing them with a cascade architecture in this capstone project.</w:t>
+      </w:r>
+    </w:p>
+    <w:p>
+      <w:pPr>
+        <w:spacing w:line="360" w:lineRule="auto"/>
+        <w:rPr>
+          <w:sz w:val="24"/>
+          <w:szCs w:val="24"/>
+        </w:rPr>
+      </w:pPr>
+    </w:p>
+    <w:p>
+      <w:pPr>
+        <w:pStyle w:val="Heading3"/>
+        <w:spacing w:line="360" w:lineRule="auto"/>
+        <w:rPr>
+          <w:sz w:val="24"/>
+          <w:szCs w:val="24"/>
+        </w:rPr>
+      </w:pPr>
+      <w:bookmarkStart w:id="9" w:name="_Toc1156669356"/>
+      <w:r>
+        <w:rPr>
+          <w:sz w:val="24"/>
+          <w:szCs w:val="24"/>
+        </w:rPr>
+        <w:t xml:space="preserve">Review of </w:t>
+      </w:r>
+      <w:r>
+        <w:rPr>
+          <w:sz w:val="24"/>
+          <w:szCs w:val="24"/>
+        </w:rPr>
+        <w:t>Work</w:t>
+      </w:r>
+      <w:r>
+        <w:rPr>
+          <w:sz w:val="24"/>
+          <w:szCs w:val="24"/>
+        </w:rPr>
+        <w:t xml:space="preserve"> 3</w:t>
+      </w:r>
+      <w:bookmarkEnd w:id="9"/>
+    </w:p>
+    <w:p>
+      <w:pPr>
+        <w:spacing w:line="360" w:lineRule="auto"/>
+        <w:rPr>
+          <w:sz w:val="24"/>
+          <w:szCs w:val="24"/>
+        </w:rPr>
+      </w:pPr>
+      <w:r>
+        <w:rPr>
+          <w:sz w:val="24"/>
+          <w:szCs w:val="24"/>
+        </w:rPr>
+        <w:t>Cascading Multi-Agent Anomaly Detection in Surveillance Systems via Vision-Language Models and Embedding-Based Classification (</w:t>
+      </w:r>
+      <w:proofErr w:type="spellStart"/>
+      <w:r>
+        <w:rPr>
+          <w:sz w:val="24"/>
+          <w:szCs w:val="24"/>
+        </w:rPr>
+        <w:t>arXiv</w:t>
+      </w:r>
+      <w:proofErr w:type="spellEnd"/>
+      <w:r>
+        <w:rPr>
+          <w:sz w:val="24"/>
+          <w:szCs w:val="24"/>
+        </w:rPr>
+        <w:t xml:space="preserve"> 2601.06204v3)</w:t>
+      </w:r>
+    </w:p>
+    <w:p>
+      <w:pPr>
+        <w:spacing w:line="360" w:lineRule="auto"/>
+        <w:ind w:firstLine="720"/>
+        <w:rPr>
+          <w:sz w:val="24"/>
+          <w:szCs w:val="24"/>
+        </w:rPr>
+      </w:pPr>
+    </w:p>
+    <w:p>
+      <w:pPr>
+        <w:spacing w:line="360" w:lineRule="auto"/>
+        <w:rPr>
+          <w:sz w:val="24"/>
+          <w:szCs w:val="24"/>
+        </w:rPr>
+      </w:pPr>
+      <w:r>
+        <w:rPr>
+          <w:sz w:val="24"/>
+          <w:szCs w:val="24"/>
+        </w:rPr>
+        <w:t>This study presents a multi-level cascade system for anomaly detection in surveillance videos that combines multiple detection paradigms to support both real-time performance and semantic interpretability. The authors highlight limitations of existing approaches: object detectors are fast but limited in semantic understanding, reconstruction-based methods lack contextual awareness, and large vision-language models provide rich semantic insight but at a high computational cost. To address these trade-offs, the paper introduces a cascading framework in which lightweight early stages—such as fast object detection and autoencoder-based reconstruction scoring—filter routine frames, while only uncertain cases are escalated to a higher-level semantic reasoning stage powered by a vision-language model. The system operates within a multi-agent architecture featuring adaptive escalation thresholds and a publish–subscribe backbone, enabling scalable deployment and asynchronous communication across modules. Experiments on the UCF-Crime dataset show that the cascade reduces average latency by approximately threefold compared to direct vision-language inference while maintaining strong detection accuracy and interpretable anomaly labeling.</w:t>
+      </w:r>
+    </w:p>
+    <w:p>
+      <w:pPr>
+        <w:spacing w:line="360" w:lineRule="auto"/>
+        <w:ind w:firstLine="720"/>
+        <w:rPr>
+          <w:sz w:val="24"/>
+          <w:szCs w:val="24"/>
+        </w:rPr>
+      </w:pPr>
+    </w:p>
+    <w:p>
+      <w:pPr>
+        <w:pStyle w:val="Heading4"/>
+      </w:pPr>
+      <w:r>
+        <w:t>Relation to This Project:</w:t>
+      </w:r>
+    </w:p>
+    <w:p>
+      <w:pPr>
+        <w:spacing w:line="360" w:lineRule="auto"/>
+        <w:rPr>
+          <w:sz w:val="24"/>
+          <w:szCs w:val="24"/>
+        </w:rPr>
+      </w:pPr>
+      <w:r>
+        <w:rPr>
+          <w:sz w:val="24"/>
+          <w:szCs w:val="24"/>
+        </w:rPr>
+        <w:t xml:space="preserve">This study reinforces the foundational concept of cascading detection architectures by demonstrating how early-exit stages can reduce computational load and improve responsiveness without compromising accuracy or interpretability. Its multi-stage design closely parallels the project’s cascade structure (broad anomaly detector → refined detector → confirmatory logic), illustrating how layered screening can enhance both efficiency and alert quality. Additionally, the inclusion of a higher-level reasoning stage highlights the broader value of escalation mechanisms for interpreting ambiguous conditions, aligning with the capstone’s emphasis on producing meaningful early-warning alerts rather than excessive or noisy </w:t>
+      </w:r>
+      <w:proofErr w:type="spellStart"/>
+      <w:r>
+        <w:rPr>
+          <w:sz w:val="24"/>
+          <w:szCs w:val="24"/>
+        </w:rPr>
+        <w:t>signals.</w:t>
+      </w:r>
+      <w:r>
+        <w:rPr>
+          <w:sz w:val="24"/>
+          <w:szCs w:val="24"/>
+        </w:rPr>
+        <w:t>a</w:t>
+      </w:r>
+      <w:proofErr w:type="spellEnd"/>
+      <w:r>
+        <w:rPr>
           <w:sz w:val="24"/>
           <w:szCs w:val="24"/>
         </w:rPr>
@@ -2750,278 +3118,6 @@
       </w:r>
       <w:r>
         <w:rPr>
-          <w:color w:val="00B050"/>
-          <w:sz w:val="24"/>
-          <w:szCs w:val="24"/>
-        </w:rPr>
-        <w:t>The description logically addresses how </w:t>
-      </w:r>
-      <w:r>
-        <w:rPr>
-          <w:i/>
-          <w:iCs/>
-          <w:color w:val="00B050"/>
-          <w:sz w:val="24"/>
-          <w:szCs w:val="24"/>
-        </w:rPr>
-        <w:t>each</w:t>
-      </w:r>
-      <w:r>
-        <w:rPr>
-          <w:color w:val="00B050"/>
-          <w:sz w:val="24"/>
-          <w:szCs w:val="24"/>
-        </w:rPr>
-        <w:t> published work relates to the research question or organizational need from part A1.</w:t>
-      </w:r>
-    </w:p>
-    <w:p>
-      <w:pPr>
-        <w:pBdr>
-          <w:top w:val="nil"/>
-          <w:left w:val="nil"/>
-          <w:bottom w:val="nil"/>
-          <w:right w:val="nil"/>
-          <w:between w:val="nil"/>
-        </w:pBdr>
-        <w:spacing w:line="360" w:lineRule="auto"/>
-        <w:ind w:firstLine="720"/>
-        <w:rPr>
-          <w:color w:val="000000"/>
-          <w:sz w:val="24"/>
-          <w:szCs w:val="24"/>
-        </w:rPr>
-      </w:pPr>
-      <w:r>
-        <w:rPr>
-          <w:color w:val="000000" w:themeColor="text1"/>
-          <w:sz w:val="24"/>
-          <w:szCs w:val="24"/>
-        </w:rPr>
-        <w:t xml:space="preserve">The work only needs to relate to an aspect of your project, e.g., methodology, </w:t>
-      </w:r>
-      <w:r>
-        <w:rPr>
-          <w:color w:val="000000" w:themeColor="text1"/>
-          <w:sz w:val="24"/>
-          <w:szCs w:val="24"/>
-        </w:rPr>
-        <w:t>tools</w:t>
-      </w:r>
-      <w:r>
-        <w:rPr>
-          <w:color w:val="000000" w:themeColor="text1"/>
-          <w:sz w:val="24"/>
-          <w:szCs w:val="24"/>
-        </w:rPr>
-        <w:t xml:space="preserve">, </w:t>
-      </w:r>
-      <w:r>
-        <w:rPr>
-          <w:color w:val="000000" w:themeColor="text1"/>
-          <w:sz w:val="24"/>
-          <w:szCs w:val="24"/>
-        </w:rPr>
-        <w:t>statistical methods</w:t>
-      </w:r>
-      <w:r>
-        <w:rPr>
-          <w:color w:val="000000" w:themeColor="text1"/>
-          <w:sz w:val="24"/>
-          <w:szCs w:val="24"/>
-        </w:rPr>
-        <w:t xml:space="preserve">, </w:t>
-      </w:r>
-      <w:r>
-        <w:rPr>
-          <w:color w:val="000000" w:themeColor="text1"/>
-          <w:sz w:val="24"/>
-          <w:szCs w:val="24"/>
-        </w:rPr>
-        <w:t>models</w:t>
-      </w:r>
-      <w:r>
-        <w:rPr>
-          <w:color w:val="000000" w:themeColor="text1"/>
-          <w:sz w:val="24"/>
-          <w:szCs w:val="24"/>
-        </w:rPr>
-        <w:t xml:space="preserve">, etc. </w:t>
-      </w:r>
-    </w:p>
-    <w:p>
-      <w:pPr>
-        <w:spacing w:line="360" w:lineRule="auto"/>
-        <w:ind w:firstLine="720"/>
-      </w:pPr>
-      <w:r>
-        <w:rPr>
-          <w:sz w:val="24"/>
-          <w:szCs w:val="24"/>
-        </w:rPr>
-        <w:t>For each work, s</w:t>
-      </w:r>
-      <w:r>
-        <w:rPr>
-          <w:sz w:val="24"/>
-          <w:szCs w:val="24"/>
-        </w:rPr>
-        <w:t>tart with an overview of the article, summarize the major points discussed</w:t>
-      </w:r>
-      <w:r>
-        <w:rPr>
-          <w:sz w:val="24"/>
-          <w:szCs w:val="24"/>
-        </w:rPr>
-        <w:t xml:space="preserve">, </w:t>
-      </w:r>
-      <w:r>
-        <w:rPr>
-          <w:sz w:val="24"/>
-          <w:szCs w:val="24"/>
-        </w:rPr>
-        <w:t xml:space="preserve">and </w:t>
-      </w:r>
-      <w:r>
-        <w:rPr>
-          <w:sz w:val="24"/>
-          <w:szCs w:val="24"/>
-        </w:rPr>
-        <w:t>include an APA style</w:t>
-      </w:r>
-      <w:r>
-        <w:rPr>
-          <w:sz w:val="24"/>
-          <w:szCs w:val="24"/>
-        </w:rPr>
-        <w:t xml:space="preserve"> </w:t>
-      </w:r>
-      <w:r>
-        <w:rPr>
-          <w:sz w:val="24"/>
-          <w:szCs w:val="24"/>
-          <w:u w:val="single"/>
-        </w:rPr>
-        <w:t>in-text citation</w:t>
-      </w:r>
-      <w:r>
-        <w:rPr>
-          <w:sz w:val="24"/>
-          <w:szCs w:val="24"/>
-        </w:rPr>
-        <w:t>, e.g., (Author, year)</w:t>
-      </w:r>
-      <w:r>
-        <w:rPr>
-          <w:sz w:val="24"/>
-          <w:szCs w:val="24"/>
-        </w:rPr>
-        <w:t xml:space="preserve">. </w:t>
-      </w:r>
-      <w:r>
-        <w:rPr>
-          <w:sz w:val="24"/>
-          <w:szCs w:val="24"/>
-        </w:rPr>
-        <w:t>Next</w:t>
-      </w:r>
-      <w:r>
-        <w:rPr>
-          <w:sz w:val="24"/>
-          <w:szCs w:val="24"/>
-        </w:rPr>
-        <w:t>,</w:t>
-      </w:r>
-      <w:r>
-        <w:rPr>
-          <w:sz w:val="24"/>
-          <w:szCs w:val="24"/>
-        </w:rPr>
-        <w:t xml:space="preserve"> d</w:t>
-      </w:r>
-      <w:r>
-        <w:rPr>
-          <w:sz w:val="24"/>
-          <w:szCs w:val="24"/>
-        </w:rPr>
-        <w:t xml:space="preserve">escribe how the work relates to </w:t>
-      </w:r>
-      <w:r>
-        <w:rPr>
-          <w:sz w:val="24"/>
-          <w:szCs w:val="24"/>
-        </w:rPr>
-        <w:t xml:space="preserve">the research question or organizational need </w:t>
-      </w:r>
-      <w:r>
-        <w:rPr>
-          <w:sz w:val="24"/>
-          <w:szCs w:val="24"/>
-        </w:rPr>
-        <w:t>provided in A.1.</w:t>
-      </w:r>
-    </w:p>
-    <w:p>
-      <w:pPr>
-        <w:pStyle w:val="Heading3"/>
-        <w:spacing w:line="360" w:lineRule="auto"/>
-        <w:rPr>
-          <w:sz w:val="24"/>
-          <w:szCs w:val="24"/>
-        </w:rPr>
-      </w:pPr>
-      <w:bookmarkStart w:id="7" w:name="_Toc694593955"/>
-      <w:r>
-        <w:rPr>
-          <w:sz w:val="24"/>
-          <w:szCs w:val="24"/>
-        </w:rPr>
-        <w:t xml:space="preserve">Review of </w:t>
-      </w:r>
-      <w:r>
-        <w:rPr>
-          <w:sz w:val="24"/>
-          <w:szCs w:val="24"/>
-        </w:rPr>
-        <w:t>Work</w:t>
-      </w:r>
-      <w:r>
-        <w:rPr>
-          <w:sz w:val="24"/>
-          <w:szCs w:val="24"/>
-        </w:rPr>
-        <w:t xml:space="preserve"> 1</w:t>
-      </w:r>
-      <w:bookmarkEnd w:id="7"/>
-    </w:p>
-    <w:p>
-      <w:pPr>
-        <w:spacing w:line="360" w:lineRule="auto"/>
-        <w:ind w:firstLine="720"/>
-      </w:pPr>
-      <w:r>
-        <w:rPr>
-          <w:sz w:val="24"/>
-          <w:szCs w:val="24"/>
-        </w:rPr>
-        <w:t xml:space="preserve">Include </w:t>
-      </w:r>
-      <w:r>
-        <w:rPr>
-          <w:sz w:val="24"/>
-          <w:szCs w:val="24"/>
-        </w:rPr>
-        <w:t>a</w:t>
-      </w:r>
-      <w:r>
-        <w:rPr>
-          <w:sz w:val="24"/>
-          <w:szCs w:val="24"/>
-        </w:rPr>
-        <w:t xml:space="preserve"> </w:t>
-      </w:r>
-      <w:r>
-        <w:rPr>
           <w:sz w:val="24"/>
           <w:szCs w:val="24"/>
         </w:rPr>
@@ -3032,308 +3128,15 @@
           <w:sz w:val="24"/>
           <w:szCs w:val="24"/>
         </w:rPr>
-        <w:t>ummary, APA style in-text citation</w:t>
-      </w:r>
-      <w:r>
-        <w:rPr>
-          <w:sz w:val="24"/>
-          <w:szCs w:val="24"/>
-        </w:rPr>
-        <w:t xml:space="preserve">, e.g., </w:t>
-      </w:r>
-      <w:sdt>
-        <w:sdtPr>
-          <w:rPr>
-            <w:sz w:val="24"/>
-            <w:szCs w:val="24"/>
-          </w:rPr>
-          <w:id w:val="-1703938768"/>
-          <w:citation/>
-        </w:sdtPr>
-        <w:sdtContent>
-          <w:r>
-            <w:rPr>
-              <w:sz w:val="24"/>
-              <w:szCs w:val="24"/>
-            </w:rPr>
-            <w:fldChar w:fldCharType="begin"/>
-          </w:r>
-          <w:r>
-            <w:rPr>
-              <w:sz w:val="24"/>
-              <w:szCs w:val="24"/>
-            </w:rPr>
-            <w:instrText xml:space="preserve">CITATION Smi23 \l 1033 </w:instrText>
-          </w:r>
-          <w:r>
-            <w:rPr>
-              <w:sz w:val="24"/>
-              <w:szCs w:val="24"/>
-            </w:rPr>
-            <w:fldChar w:fldCharType="separate"/>
-          </w:r>
-          <w:r>
-            <w:rPr>
-              <w:noProof/>
-              <w:sz w:val="24"/>
-              <w:szCs w:val="24"/>
-            </w:rPr>
-            <w:t>(Smith, 2023)</w:t>
-          </w:r>
-          <w:r>
-            <w:rPr>
-              <w:sz w:val="24"/>
-              <w:szCs w:val="24"/>
-            </w:rPr>
-            <w:fldChar w:fldCharType="end"/>
-          </w:r>
-        </w:sdtContent>
-      </w:sdt>
-      <w:r>
-        <w:rPr>
-          <w:sz w:val="24"/>
-          <w:szCs w:val="24"/>
-        </w:rPr>
-        <w:t>, and relation to the research question or organizational need here.</w:t>
-      </w:r>
-      <w:r>
-        <w:rPr>
-          <w:sz w:val="24"/>
-          <w:szCs w:val="24"/>
-        </w:rPr>
-        <w:t xml:space="preserve"> </w:t>
-      </w:r>
-    </w:p>
-    <w:p>
-      <w:pPr>
-        <w:pStyle w:val="Heading3"/>
-        <w:spacing w:line="360" w:lineRule="auto"/>
-        <w:rPr>
-          <w:sz w:val="24"/>
-          <w:szCs w:val="24"/>
-        </w:rPr>
-      </w:pPr>
-      <w:bookmarkStart w:id="8" w:name="_Toc475195288"/>
-      <w:r>
-        <w:rPr>
-          <w:sz w:val="24"/>
-          <w:szCs w:val="24"/>
-        </w:rPr>
-        <w:t xml:space="preserve">Review of </w:t>
-      </w:r>
-      <w:r>
-        <w:rPr>
-          <w:sz w:val="24"/>
-          <w:szCs w:val="24"/>
-        </w:rPr>
-        <w:t>Work</w:t>
-      </w:r>
-      <w:r>
-        <w:rPr>
-          <w:sz w:val="24"/>
-          <w:szCs w:val="24"/>
-        </w:rPr>
-        <w:t xml:space="preserve"> </w:t>
-      </w:r>
-      <w:r>
-        <w:rPr>
-          <w:sz w:val="24"/>
-          <w:szCs w:val="24"/>
-        </w:rPr>
-        <w:t>2</w:t>
-      </w:r>
-      <w:bookmarkEnd w:id="8"/>
-    </w:p>
-    <w:p>
-      <w:pPr>
-        <w:spacing w:line="360" w:lineRule="auto"/>
-        <w:ind w:firstLine="720"/>
-        <w:rPr>
-          <w:sz w:val="24"/>
-          <w:szCs w:val="24"/>
-        </w:rPr>
-      </w:pPr>
-      <w:r>
-        <w:rPr>
-          <w:sz w:val="24"/>
-          <w:szCs w:val="24"/>
-        </w:rPr>
-        <w:t xml:space="preserve">Include </w:t>
-      </w:r>
-      <w:r>
-        <w:rPr>
-          <w:sz w:val="24"/>
-          <w:szCs w:val="24"/>
-        </w:rPr>
-        <w:t>a</w:t>
-      </w:r>
-      <w:r>
-        <w:rPr>
-          <w:sz w:val="24"/>
-          <w:szCs w:val="24"/>
-        </w:rPr>
-        <w:t xml:space="preserve"> </w:t>
-      </w:r>
-      <w:r>
-        <w:rPr>
-          <w:sz w:val="24"/>
-          <w:szCs w:val="24"/>
-        </w:rPr>
-        <w:t>s</w:t>
-      </w:r>
-      <w:r>
-        <w:rPr>
-          <w:sz w:val="24"/>
-          <w:szCs w:val="24"/>
-        </w:rPr>
-        <w:t>ummary, APA style in-text citation</w:t>
-      </w:r>
-      <w:r>
-        <w:rPr>
-          <w:sz w:val="24"/>
-          <w:szCs w:val="24"/>
-        </w:rPr>
-        <w:t xml:space="preserve">, e.g., </w:t>
-      </w:r>
-      <w:sdt>
-        <w:sdtPr>
-          <w:rPr>
-            <w:sz w:val="24"/>
-            <w:szCs w:val="24"/>
-          </w:rPr>
-          <w:id w:val="617423978"/>
-          <w:citation/>
-        </w:sdtPr>
-        <w:sdtContent>
-          <w:r>
-            <w:rPr>
-              <w:sz w:val="24"/>
-              <w:szCs w:val="24"/>
-            </w:rPr>
-            <w:fldChar w:fldCharType="begin"/>
-          </w:r>
-          <w:r>
-            <w:rPr>
-              <w:sz w:val="24"/>
-              <w:szCs w:val="24"/>
-            </w:rPr>
-            <w:instrText xml:space="preserve">CITATION Purnd \l 1033 </w:instrText>
-          </w:r>
-          <w:r>
-            <w:rPr>
-              <w:sz w:val="24"/>
-              <w:szCs w:val="24"/>
-            </w:rPr>
-            <w:fldChar w:fldCharType="separate"/>
-          </w:r>
-          <w:r>
-            <w:rPr>
-              <w:noProof/>
-              <w:sz w:val="24"/>
-              <w:szCs w:val="24"/>
-            </w:rPr>
-            <w:t>(Purdue University, n.d.)</w:t>
-          </w:r>
-          <w:r>
-            <w:rPr>
-              <w:sz w:val="24"/>
-              <w:szCs w:val="24"/>
-            </w:rPr>
-            <w:fldChar w:fldCharType="end"/>
-          </w:r>
-        </w:sdtContent>
-      </w:sdt>
-      <w:r>
-        <w:rPr>
-          <w:sz w:val="24"/>
-          <w:szCs w:val="24"/>
-        </w:rPr>
-        <w:t>, and relation to the research question or organizational need here.</w:t>
-      </w:r>
-      <w:r>
-        <w:rPr>
-          <w:sz w:val="24"/>
-          <w:szCs w:val="24"/>
-        </w:rPr>
-        <w:t xml:space="preserve"> </w:t>
-      </w:r>
-    </w:p>
-    <w:p>
-      <w:pPr>
-        <w:pStyle w:val="Heading3"/>
-        <w:spacing w:line="360" w:lineRule="auto"/>
-        <w:rPr>
-          <w:sz w:val="24"/>
-          <w:szCs w:val="24"/>
-        </w:rPr>
-      </w:pPr>
-      <w:bookmarkStart w:id="9" w:name="_Toc1156669356"/>
-      <w:r>
-        <w:rPr>
-          <w:sz w:val="24"/>
-          <w:szCs w:val="24"/>
-        </w:rPr>
-        <w:t xml:space="preserve">Review of </w:t>
-      </w:r>
-      <w:r>
-        <w:rPr>
-          <w:sz w:val="24"/>
-          <w:szCs w:val="24"/>
-        </w:rPr>
-        <w:t>Work</w:t>
-      </w:r>
-      <w:r>
-        <w:rPr>
-          <w:sz w:val="24"/>
-          <w:szCs w:val="24"/>
-        </w:rPr>
-        <w:t xml:space="preserve"> 3</w:t>
-      </w:r>
-      <w:bookmarkEnd w:id="9"/>
-    </w:p>
-    <w:p>
-      <w:pPr>
-        <w:spacing w:line="360" w:lineRule="auto"/>
-        <w:ind w:firstLine="720"/>
-        <w:rPr>
-          <w:sz w:val="24"/>
-          <w:szCs w:val="24"/>
-        </w:rPr>
-      </w:pPr>
-      <w:r>
-        <w:rPr>
-          <w:sz w:val="24"/>
-          <w:szCs w:val="24"/>
-        </w:rPr>
-        <w:t xml:space="preserve">Include </w:t>
-      </w:r>
-      <w:r>
-        <w:rPr>
-          <w:sz w:val="24"/>
-          <w:szCs w:val="24"/>
-        </w:rPr>
-        <w:t>a</w:t>
-      </w:r>
-      <w:r>
-        <w:rPr>
-          <w:sz w:val="24"/>
-          <w:szCs w:val="24"/>
-        </w:rPr>
-        <w:t xml:space="preserve"> </w:t>
-      </w:r>
-      <w:r>
-        <w:rPr>
-          <w:sz w:val="24"/>
-          <w:szCs w:val="24"/>
-        </w:rPr>
-        <w:t>s</w:t>
-      </w:r>
-      <w:r>
-        <w:rPr>
-          <w:sz w:val="24"/>
-          <w:szCs w:val="24"/>
-        </w:rPr>
-        <w:t>ummary, APA style in-text citation</w:t>
+        <w:t xml:space="preserve">ummary, </w:t>
+      </w:r>
+      <w:r>
+        <w:rPr>
+          <w:sz w:val="24"/>
+          <w:szCs w:val="24"/>
+        </w:rPr>
+        <w:lastRenderedPageBreak/>
+        <w:t>APA style in-text citation</w:t>
       </w:r>
       <w:r>
         <w:rPr>
@@ -3811,14 +3614,7 @@
           <w:sz w:val="24"/>
           <w:szCs w:val="24"/>
         </w:rPr>
-        <w:t>etermine whether a three-stage anomaly detection cascade improves alert quality compared with a single Isolation Forest baseline for industrial pump sensor data.</w:t>
-      </w:r>
-      <w:r>
-        <w:rPr>
-          <w:sz w:val="24"/>
-          <w:szCs w:val="24"/>
-        </w:rPr>
-        <w:t xml:space="preserve"> </w:t>
+        <w:t xml:space="preserve">etermine whether a three-stage anomaly detection cascade improves alert quality compared with a single Isolation Forest baseline for industrial pump sensor data. </w:t>
       </w:r>
     </w:p>
     <w:p>
@@ -3865,14 +3661,7 @@
           <w:sz w:val="24"/>
           <w:szCs w:val="24"/>
         </w:rPr>
-        <w:t>Complete the Bronze layer of the Medallion Architecture by ingesting and standardizing the raw pump sensor data so it is organized in a consistent format for later analysis.</w:t>
-      </w:r>
-      <w:r>
-        <w:rPr>
-          <w:sz w:val="24"/>
-          <w:szCs w:val="24"/>
-        </w:rPr>
-        <w:t xml:space="preserve"> </w:t>
+        <w:t xml:space="preserve">Complete the Bronze layer of the Medallion Architecture by ingesting and standardizing the raw pump sensor data so it is organized in a consistent format for later analysis. </w:t>
       </w:r>
     </w:p>
     <w:p>
@@ -4052,14 +3841,7 @@
           <w:sz w:val="24"/>
           <w:szCs w:val="24"/>
         </w:rPr>
-        <w:t>A Silver Pre-EDA notebook that performs initial cleaning, missing-value review, structural preparation, and readiness checks for deeper analysis.</w:t>
-      </w:r>
-      <w:r>
-        <w:rPr>
-          <w:sz w:val="24"/>
-          <w:szCs w:val="24"/>
-        </w:rPr>
-        <w:t xml:space="preserve"> </w:t>
+        <w:t xml:space="preserve">A Silver Pre-EDA notebook that performs initial cleaning, missing-value review, structural preparation, and readiness checks for deeper analysis. </w:t>
       </w:r>
     </w:p>
     <w:p>
@@ -4090,14 +3872,7 @@
           <w:sz w:val="24"/>
           <w:szCs w:val="24"/>
         </w:rPr>
-        <w:t xml:space="preserve">: </w:t>
-      </w:r>
-      <w:r>
-        <w:rPr>
-          <w:sz w:val="24"/>
-          <w:szCs w:val="24"/>
-        </w:rPr>
-        <w:t>A Silver EDA notebook that documents data profiling, exploratory analysis, and feature behavior analysis across normal and abnormal operating patterns.</w:t>
+        <w:t>: A Silver EDA notebook that documents data profiling, exploratory analysis, and feature behavior analysis across normal and abnormal operating patterns.</w:t>
       </w:r>
     </w:p>
     <w:p>
@@ -4763,7 +4538,60 @@
           <w:sz w:val="24"/>
           <w:szCs w:val="24"/>
         </w:rPr>
-        <w:t xml:space="preserve"> Architecture with Bronze, Silver, and </w:t>
+        <w:t xml:space="preserve"> Architecture with Bronze, Silver, and Gold levels.</w:t>
+      </w:r>
+    </w:p>
+    <w:p>
+      <w:pPr>
+        <w:spacing w:line="360" w:lineRule="auto"/>
+        <w:ind w:firstLine="720"/>
+        <w:rPr>
+          <w:sz w:val="24"/>
+          <w:szCs w:val="24"/>
+        </w:rPr>
+      </w:pPr>
+    </w:p>
+    <w:p>
+      <w:pPr>
+        <w:spacing w:line="360" w:lineRule="auto"/>
+        <w:ind w:firstLine="720"/>
+        <w:rPr>
+          <w:sz w:val="24"/>
+          <w:szCs w:val="24"/>
+        </w:rPr>
+      </w:pPr>
+      <w:r>
+        <w:rPr>
+          <w:sz w:val="24"/>
+          <w:szCs w:val="24"/>
+        </w:rPr>
+        <w:t>The Bronze level will involve data ingestion, validation, and standardization of the raw data from the industrial pump sensors for use in subsequent steps. The Silver level will involve data cleaning, examination for missing data, profiling, exploratory data analysis, feature behavior analysis, and the generation of supplementary charts, summary tables, and analysis artifacts. The Gold level will involve model development and comparison between a single Isolation Forest model and a three-stage cascade comparative model.</w:t>
+      </w:r>
+    </w:p>
+    <w:p>
+      <w:pPr>
+        <w:spacing w:line="360" w:lineRule="auto"/>
+        <w:ind w:firstLine="720"/>
+        <w:rPr>
+          <w:sz w:val="24"/>
+          <w:szCs w:val="24"/>
+        </w:rPr>
+      </w:pPr>
+    </w:p>
+    <w:p>
+      <w:pPr>
+        <w:spacing w:line="360" w:lineRule="auto"/>
+        <w:rPr>
+          <w:sz w:val="24"/>
+          <w:szCs w:val="24"/>
+        </w:rPr>
+      </w:pPr>
+      <w:r>
+        <w:rPr>
+          <w:sz w:val="24"/>
+          <w:szCs w:val="24"/>
+        </w:rPr>
+        <w:t xml:space="preserve">The project will also involve the assessment of alert quality using alert-centric metrics, such as the total number of alerts produced, the number of false positives during normal times, the capture of anomalies or failure periods, precision and recall as applicable, and the reduction in the number of alerts from the baseline to the cascade model. The final project deliverables will include the Bronze, Silver Pre-EDA, Silver EDA, and </w:t>
       </w:r>
       <w:proofErr w:type="gramStart"/>
       <w:r>
@@ -4779,7 +4607,7 @@
           <w:sz w:val="24"/>
           <w:szCs w:val="24"/>
         </w:rPr>
-        <w:t xml:space="preserve"> levels.</w:t>
+        <w:t xml:space="preserve"> notebooks, as well as supplementary visualizations, comparison results, and a written explanation of the results.</w:t>
       </w:r>
     </w:p>
     <w:p>
@@ -4795,18 +4623,100 @@
     <w:p>
       <w:pPr>
         <w:spacing w:line="360" w:lineRule="auto"/>
+        <w:rPr>
+          <w:sz w:val="24"/>
+          <w:szCs w:val="24"/>
+        </w:rPr>
+      </w:pPr>
+      <w:r>
+        <w:rPr>
+          <w:sz w:val="24"/>
+          <w:szCs w:val="24"/>
+        </w:rPr>
+        <w:t xml:space="preserve">A lightweight pipeline-ready structure, shared configuration, or modularity can also be employed as appropriate, </w:t>
+      </w:r>
+      <w:proofErr w:type="gramStart"/>
+      <w:r>
+        <w:rPr>
+          <w:sz w:val="24"/>
+          <w:szCs w:val="24"/>
+        </w:rPr>
+        <w:t>provided that</w:t>
+      </w:r>
+      <w:proofErr w:type="gramEnd"/>
+      <w:r>
+        <w:rPr>
+          <w:sz w:val="24"/>
+          <w:szCs w:val="24"/>
+        </w:rPr>
+        <w:t xml:space="preserve"> it aids in the data analytics process and does not increase the scope of the project beyond its current capstone project boundaries.</w:t>
+      </w:r>
+      <w:r>
+        <w:rPr>
+          <w:sz w:val="24"/>
+          <w:szCs w:val="24"/>
+        </w:rPr>
+        <w:t xml:space="preserve"> </w:t>
+      </w:r>
+    </w:p>
+    <w:p>
+      <w:pPr>
+        <w:spacing w:line="360" w:lineRule="auto"/>
         <w:ind w:firstLine="720"/>
         <w:rPr>
           <w:sz w:val="24"/>
           <w:szCs w:val="24"/>
         </w:rPr>
       </w:pPr>
-      <w:r>
-        <w:rPr>
-          <w:sz w:val="24"/>
-          <w:szCs w:val="24"/>
-        </w:rPr>
-        <w:t>The Bronze level will involve data ingestion, validation, and standardization of the raw data from the industrial pump sensors for use in subsequent steps. The Silver level will involve data cleaning, examination for missing data, profiling, exploratory data analysis, feature behavior analysis, and the generation of supplementary charts, summary tables, and analysis artifacts. The Gold level will involve model development and comparison between a single Isolation Forest model and a three-stage cascade comparative model.</w:t>
+    </w:p>
+    <w:p>
+      <w:pPr>
+        <w:pStyle w:val="Heading3"/>
+        <w:spacing w:line="360" w:lineRule="auto"/>
+        <w:rPr>
+          <w:sz w:val="24"/>
+          <w:szCs w:val="24"/>
+        </w:rPr>
+      </w:pPr>
+      <w:bookmarkStart w:id="16" w:name="_Toc2036717847"/>
+      <w:r>
+        <w:rPr>
+          <w:sz w:val="24"/>
+          <w:szCs w:val="24"/>
+        </w:rPr>
+        <w:t>B.2.</w:t>
+      </w:r>
+      <w:r>
+        <w:rPr>
+          <w:sz w:val="24"/>
+          <w:szCs w:val="24"/>
+        </w:rPr>
+        <w:t>B</w:t>
+      </w:r>
+      <w:r>
+        <w:rPr>
+          <w:sz w:val="24"/>
+          <w:szCs w:val="24"/>
+        </w:rPr>
+        <w:t xml:space="preserve"> Not included in Project Scope</w:t>
+      </w:r>
+      <w:bookmarkEnd w:id="16"/>
+    </w:p>
+    <w:p/>
+    <w:p>
+      <w:pPr>
+        <w:spacing w:line="360" w:lineRule="auto"/>
+        <w:rPr>
+          <w:sz w:val="24"/>
+          <w:szCs w:val="24"/>
+        </w:rPr>
+      </w:pPr>
+      <w:r>
+        <w:rPr>
+          <w:sz w:val="24"/>
+          <w:szCs w:val="24"/>
+        </w:rPr>
+        <w:t>The project does not involve full production deployment, a full streaming solution, extensive platform engineering, or multi-dataset automation as its main goals.</w:t>
       </w:r>
     </w:p>
     <w:p>
@@ -4832,7 +4742,33 @@
           <w:sz w:val="24"/>
           <w:szCs w:val="24"/>
         </w:rPr>
-        <w:t xml:space="preserve">The project will also involve the assessment of alert quality using alert-centric metrics, such as the total number of alerts produced, the number of false positives during normal times, the capture of anomalies or failure periods, precision and recall as applicable, and the reduction in the number of alerts from the baseline to the cascade model. The final project deliverables will include the Bronze, Silver Pre-EDA, Silver EDA, and </w:t>
+        <w:t>It also does not involve extensive production implementation of Kafka, PostgreSQL, or a production dashboard as its main goals. Although the overall project context may involve initial framework or plans for future pipeline, streaming, database, dashboard, or synthetic data generation, these are considered future work unless a small part of it is trivial to add without affecting the overall scope of the capstone.</w:t>
+      </w:r>
+    </w:p>
+    <w:p>
+      <w:pPr>
+        <w:spacing w:line="360" w:lineRule="auto"/>
+        <w:ind w:firstLine="720"/>
+        <w:rPr>
+          <w:sz w:val="24"/>
+          <w:szCs w:val="24"/>
+        </w:rPr>
+      </w:pPr>
+    </w:p>
+    <w:p>
+      <w:pPr>
+        <w:spacing w:line="360" w:lineRule="auto"/>
+        <w:rPr>
+          <w:sz w:val="24"/>
+          <w:szCs w:val="24"/>
+        </w:rPr>
+      </w:pPr>
+      <w:r>
+        <w:rPr>
+          <w:sz w:val="24"/>
+          <w:szCs w:val="24"/>
+        </w:rPr>
+        <w:t xml:space="preserve">The project is confined to the Data Analytics capstone scope, which means that the </w:t>
       </w:r>
       <w:proofErr w:type="gramStart"/>
       <w:r>
@@ -4840,7 +4776,7 @@
           <w:sz w:val="24"/>
           <w:szCs w:val="24"/>
         </w:rPr>
-        <w:t>Gold</w:t>
+        <w:t>main focus</w:t>
       </w:r>
       <w:proofErr w:type="gramEnd"/>
       <w:r>
@@ -4848,191 +4784,7 @@
           <w:sz w:val="24"/>
           <w:szCs w:val="24"/>
         </w:rPr>
-        <w:t xml:space="preserve"> notebooks, as well as supplementary visualizations, comparison results, and a written explanation of the results.</w:t>
-      </w:r>
-    </w:p>
-    <w:p>
-      <w:pPr>
-        <w:spacing w:line="360" w:lineRule="auto"/>
-        <w:ind w:firstLine="720"/>
-        <w:rPr>
-          <w:sz w:val="24"/>
-          <w:szCs w:val="24"/>
-        </w:rPr>
-      </w:pPr>
-    </w:p>
-    <w:p>
-      <w:pPr>
-        <w:spacing w:line="360" w:lineRule="auto"/>
-        <w:rPr>
-          <w:sz w:val="24"/>
-          <w:szCs w:val="24"/>
-        </w:rPr>
-      </w:pPr>
-      <w:r>
-        <w:rPr>
-          <w:sz w:val="24"/>
-          <w:szCs w:val="24"/>
-        </w:rPr>
-        <w:t xml:space="preserve">A lightweight pipeline-ready structure, shared configuration, or modularity can also be employed as appropriate, </w:t>
-      </w:r>
-      <w:proofErr w:type="gramStart"/>
-      <w:r>
-        <w:rPr>
-          <w:sz w:val="24"/>
-          <w:szCs w:val="24"/>
-        </w:rPr>
-        <w:t>provided that</w:t>
-      </w:r>
-      <w:proofErr w:type="gramEnd"/>
-      <w:r>
-        <w:rPr>
-          <w:sz w:val="24"/>
-          <w:szCs w:val="24"/>
-        </w:rPr>
-        <w:t xml:space="preserve"> it aids in the data analytics process and does not increase the scope of the project beyond its current capstone project boundaries.</w:t>
-      </w:r>
-      <w:r>
-        <w:rPr>
-          <w:sz w:val="24"/>
-          <w:szCs w:val="24"/>
-        </w:rPr>
-        <w:t xml:space="preserve"> </w:t>
-      </w:r>
-    </w:p>
-    <w:p>
-      <w:pPr>
-        <w:spacing w:line="360" w:lineRule="auto"/>
-        <w:ind w:firstLine="720"/>
-        <w:rPr>
-          <w:sz w:val="24"/>
-          <w:szCs w:val="24"/>
-        </w:rPr>
-      </w:pPr>
-    </w:p>
-    <w:p>
-      <w:pPr>
-        <w:pStyle w:val="Heading3"/>
-        <w:spacing w:line="360" w:lineRule="auto"/>
-        <w:rPr>
-          <w:sz w:val="24"/>
-          <w:szCs w:val="24"/>
-        </w:rPr>
-      </w:pPr>
-      <w:bookmarkStart w:id="16" w:name="_Toc2036717847"/>
-      <w:r>
-        <w:rPr>
-          <w:sz w:val="24"/>
-          <w:szCs w:val="24"/>
-        </w:rPr>
-        <w:t>B.2.</w:t>
-      </w:r>
-      <w:r>
-        <w:rPr>
-          <w:sz w:val="24"/>
-          <w:szCs w:val="24"/>
-        </w:rPr>
-        <w:t>B</w:t>
-      </w:r>
-      <w:r>
-        <w:rPr>
-          <w:sz w:val="24"/>
-          <w:szCs w:val="24"/>
-        </w:rPr>
-        <w:t xml:space="preserve"> Not included in Project Scope</w:t>
-      </w:r>
-      <w:bookmarkEnd w:id="16"/>
-    </w:p>
-    <w:p/>
-    <w:p>
-      <w:pPr>
-        <w:spacing w:line="360" w:lineRule="auto"/>
-        <w:rPr>
-          <w:sz w:val="24"/>
-          <w:szCs w:val="24"/>
-        </w:rPr>
-      </w:pPr>
-      <w:r>
-        <w:rPr>
-          <w:sz w:val="24"/>
-          <w:szCs w:val="24"/>
-        </w:rPr>
-        <w:t>The project does not involve full production deployment, a full streaming solution, extensive platform engineering, or multi-dataset automation as its main goals.</w:t>
-      </w:r>
-    </w:p>
-    <w:p>
-      <w:pPr>
-        <w:spacing w:line="360" w:lineRule="auto"/>
-        <w:ind w:firstLine="720"/>
-        <w:rPr>
-          <w:sz w:val="24"/>
-          <w:szCs w:val="24"/>
-        </w:rPr>
-      </w:pPr>
-    </w:p>
-    <w:p>
-      <w:pPr>
-        <w:spacing w:line="360" w:lineRule="auto"/>
-        <w:rPr>
-          <w:sz w:val="24"/>
-          <w:szCs w:val="24"/>
-        </w:rPr>
-      </w:pPr>
-      <w:r>
-        <w:rPr>
-          <w:sz w:val="24"/>
-          <w:szCs w:val="24"/>
-        </w:rPr>
-        <w:t>It also does not involve extensive production implementation of Kafka, PostgreSQL, or a production dashboard as its main goals. Although the overall project context may involve initial framework or plans for future pipeline, streaming, database, dashboard, or synthetic data generation, these are considered future work unless a small part of it is trivial to add without affecting the overall scope of the capstone.</w:t>
-      </w:r>
-    </w:p>
-    <w:p>
-      <w:pPr>
-        <w:spacing w:line="360" w:lineRule="auto"/>
-        <w:ind w:firstLine="720"/>
-        <w:rPr>
-          <w:sz w:val="24"/>
-          <w:szCs w:val="24"/>
-        </w:rPr>
-      </w:pPr>
-    </w:p>
-    <w:p>
-      <w:pPr>
-        <w:spacing w:line="360" w:lineRule="auto"/>
-        <w:rPr>
-          <w:sz w:val="24"/>
-          <w:szCs w:val="24"/>
-        </w:rPr>
-      </w:pPr>
-      <w:r>
-        <w:rPr>
-          <w:sz w:val="24"/>
-          <w:szCs w:val="24"/>
-        </w:rPr>
-        <w:t xml:space="preserve">The project is confined to the Data Analytics capstone scope, which means that the </w:t>
-      </w:r>
-      <w:proofErr w:type="gramStart"/>
-      <w:r>
-        <w:rPr>
-          <w:sz w:val="24"/>
-          <w:szCs w:val="24"/>
-        </w:rPr>
-        <w:t>main focus</w:t>
-      </w:r>
-      <w:proofErr w:type="gramEnd"/>
-      <w:r>
-        <w:rPr>
-          <w:sz w:val="24"/>
-          <w:szCs w:val="24"/>
-        </w:rPr>
-        <w:t xml:space="preserve"> is still on data preparation, exploratory analysis, feature behavior assessment, comparison of the anomaly model, and assessment of alert quality.</w:t>
-      </w:r>
-      <w:r>
-        <w:rPr>
-          <w:sz w:val="24"/>
-          <w:szCs w:val="24"/>
-        </w:rPr>
-        <w:t xml:space="preserve"> </w:t>
+        <w:t xml:space="preserve"> is still on data preparation, exploratory analysis, feature behavior assessment, comparison of the anomaly model, and assessment of alert quality. </w:t>
       </w:r>
       <w:r>
         <w:rPr>
@@ -5284,14 +5036,7 @@
           <w:sz w:val="24"/>
           <w:szCs w:val="24"/>
         </w:rPr>
-        <w:t>This approach is relevant to the project because it aligns with the scope of a Data Analytics capstone and offers a useful framework for transitioning from raw sensor data to a well-organized analytical comparison. It aligns with the notebook-based approach utilized in the project and ensures that the analysis is centered on data preparation, feature behavior analysis, anomaly model comparison, and analysis of results instead of production deployment.</w:t>
-      </w:r>
-      <w:r>
-        <w:rPr>
-          <w:sz w:val="24"/>
-          <w:szCs w:val="24"/>
-        </w:rPr>
-        <w:t xml:space="preserve"> </w:t>
+        <w:t xml:space="preserve">This approach is relevant to the project because it aligns with the scope of a Data Analytics capstone and offers a useful framework for transitioning from raw sensor data to a well-organized analytical comparison. It aligns with the notebook-based approach utilized in the project and ensures that the analysis is centered on data preparation, feature behavior analysis, anomaly model comparison, and analysis of results instead of production deployment. </w:t>
       </w:r>
       <w:r>
         <w:rPr>
@@ -5485,15 +5230,13 @@
               </w:rPr>
               <w:t xml:space="preserve">&amp; Dataset </w:t>
             </w:r>
-            <w:proofErr w:type="spellStart"/>
             <w:r>
               <w:rPr>
                 <w:sz w:val="24"/>
                 <w:szCs w:val="24"/>
               </w:rPr>
-              <w:t>Acquition</w:t>
-            </w:r>
-            <w:proofErr w:type="spellEnd"/>
+              <w:t>Acquisition</w:t>
+            </w:r>
           </w:p>
         </w:tc>
         <w:tc>
@@ -5800,15 +5543,13 @@
               </w:rPr>
               <w:t>Silver Pre-EDA – Cleaning, Structuring Checks, Nulls/Duplicates Review (</w:t>
             </w:r>
-            <w:proofErr w:type="spellStart"/>
             <w:r>
               <w:rPr>
                 <w:sz w:val="24"/>
                 <w:szCs w:val="24"/>
               </w:rPr>
-              <w:t>Delieveriable</w:t>
-            </w:r>
-            <w:proofErr w:type="spellEnd"/>
+              <w:t>Deliverable</w:t>
+            </w:r>
             <w:r>
               <w:rPr>
                 <w:sz w:val="24"/>
@@ -5914,15 +5655,13 @@
               </w:rPr>
               <w:t>Silver Artifacts – Feature Profiles, Sensor Behavior, Summary Tables (</w:t>
             </w:r>
-            <w:proofErr w:type="spellStart"/>
             <w:r>
               <w:rPr>
                 <w:sz w:val="24"/>
                 <w:szCs w:val="24"/>
               </w:rPr>
-              <w:t>Delieverables</w:t>
-            </w:r>
-            <w:proofErr w:type="spellEnd"/>
+              <w:t>Deliverable</w:t>
+            </w:r>
             <w:r>
               <w:rPr>
                 <w:sz w:val="24"/>
@@ -6026,17 +5765,15 @@
                 <w:sz w:val="24"/>
                 <w:szCs w:val="24"/>
               </w:rPr>
-              <w:t>Gold Preprocessing – Feature Engineering, Scaling, Alignment (</w:t>
-            </w:r>
-            <w:proofErr w:type="spellStart"/>
+              <w:t>Gold Preprocessing – Feature Engineering, Scaling, Alignment (Deliver</w:t>
+            </w:r>
             <w:r>
               <w:rPr>
                 <w:sz w:val="24"/>
                 <w:szCs w:val="24"/>
               </w:rPr>
-              <w:t>Deliever</w:t>
-            </w:r>
-            <w:proofErr w:type="spellEnd"/>
+              <w:t>able</w:t>
+            </w:r>
             <w:r>
               <w:rPr>
                 <w:sz w:val="24"/>
@@ -6141,23 +5878,7 @@
                 <w:szCs w:val="24"/>
               </w:rPr>
               <w:lastRenderedPageBreak/>
-              <w:t>Gold Baseline Modeling – Single Isolation Forest (</w:t>
-            </w:r>
-            <w:proofErr w:type="spellStart"/>
-            <w:r>
-              <w:rPr>
-                <w:sz w:val="24"/>
-                <w:szCs w:val="24"/>
-              </w:rPr>
-              <w:t>Delieverable</w:t>
-            </w:r>
-            <w:proofErr w:type="spellEnd"/>
-            <w:r>
-              <w:rPr>
-                <w:sz w:val="24"/>
-                <w:szCs w:val="24"/>
-              </w:rPr>
-              <w:t xml:space="preserve"> 1.3.2)</w:t>
+              <w:t>Gold Baseline Modeling – Single Isolation Forest (Deliverable 1.3.2)</w:t>
             </w:r>
           </w:p>
         </w:tc>
@@ -6257,15 +5978,13 @@
               </w:rPr>
               <w:t xml:space="preserve">Gold </w:t>
             </w:r>
-            <w:proofErr w:type="spellStart"/>
             <w:r>
               <w:rPr>
                 <w:sz w:val="24"/>
                 <w:szCs w:val="24"/>
               </w:rPr>
-              <w:t>Casecade</w:t>
-            </w:r>
-            <w:proofErr w:type="spellEnd"/>
+              <w:t>Cascade</w:t>
+            </w:r>
             <w:r>
               <w:rPr>
                 <w:sz w:val="24"/>
@@ -6567,15 +6286,13 @@
               </w:rPr>
               <w:t>Model Evaluation – Alert Counts, Anomaly Capture (</w:t>
             </w:r>
-            <w:proofErr w:type="spellStart"/>
             <w:r>
               <w:rPr>
                 <w:sz w:val="24"/>
                 <w:szCs w:val="24"/>
               </w:rPr>
-              <w:t>Delieverable</w:t>
-            </w:r>
-            <w:proofErr w:type="spellEnd"/>
+              <w:t>Deliverable</w:t>
+            </w:r>
             <w:r>
               <w:rPr>
                 <w:sz w:val="24"/>
@@ -6681,15 +6398,13 @@
               </w:rPr>
               <w:t xml:space="preserve">Model </w:t>
             </w:r>
-            <w:proofErr w:type="spellStart"/>
             <w:r>
               <w:rPr>
                 <w:sz w:val="24"/>
                 <w:szCs w:val="24"/>
               </w:rPr>
-              <w:t>Comparision</w:t>
-            </w:r>
-            <w:proofErr w:type="spellEnd"/>
+              <w:t>Comparison</w:t>
+            </w:r>
             <w:r>
               <w:rPr>
                 <w:sz w:val="24"/>
@@ -6795,15 +6510,13 @@
               </w:rPr>
               <w:t>Written Interpretation – Alert Quality Analysis (</w:t>
             </w:r>
-            <w:proofErr w:type="spellStart"/>
             <w:r>
               <w:rPr>
                 <w:sz w:val="24"/>
                 <w:szCs w:val="24"/>
               </w:rPr>
-              <w:t>Delieverable</w:t>
-            </w:r>
-            <w:proofErr w:type="spellEnd"/>
+              <w:t>Deliverable</w:t>
+            </w:r>
             <w:r>
               <w:rPr>
                 <w:sz w:val="24"/>
@@ -6909,15 +6622,13 @@
               </w:rPr>
               <w:t xml:space="preserve">Final </w:t>
             </w:r>
-            <w:proofErr w:type="spellStart"/>
             <w:r>
               <w:rPr>
                 <w:sz w:val="24"/>
                 <w:szCs w:val="24"/>
               </w:rPr>
-              <w:t>Completeion</w:t>
-            </w:r>
-            <w:proofErr w:type="spellEnd"/>
+              <w:t>Completion</w:t>
+            </w:r>
             <w:r>
               <w:rPr>
                 <w:sz w:val="24"/>
@@ -7895,15 +7606,13 @@
         </w:rPr>
         <w:t xml:space="preserve">More specifically, the hypothesis is that the three-stage cascade will result in a reduction in false positives, a reduction in the </w:t>
       </w:r>
-      <w:proofErr w:type="gramStart"/>
-      <w:r>
-        <w:rPr>
-          <w:sz w:val="24"/>
-          <w:szCs w:val="24"/>
-        </w:rPr>
-        <w:t>amount</w:t>
-      </w:r>
-      <w:proofErr w:type="gramEnd"/>
+      <w:r>
+        <w:rPr>
+          <w:sz w:val="24"/>
+          <w:szCs w:val="24"/>
+        </w:rPr>
+        <w:t>number</w:t>
+      </w:r>
       <w:r>
         <w:rPr>
           <w:sz w:val="24"/>
@@ -8012,14 +7721,7 @@
           <w:sz w:val="24"/>
           <w:szCs w:val="24"/>
         </w:rPr>
-        <w:t>The comparative model consists of a three-stage cascade:</w:t>
-      </w:r>
-      <w:r>
-        <w:rPr>
-          <w:sz w:val="24"/>
-          <w:szCs w:val="24"/>
-        </w:rPr>
-        <w:t xml:space="preserve"> </w:t>
+        <w:t xml:space="preserve">The comparative model consists of a three-stage cascade: </w:t>
       </w:r>
     </w:p>
     <w:p>
@@ -10135,15 +9837,13 @@
         </w:rPr>
         <w:t xml:space="preserve">” that is </w:t>
       </w:r>
-      <w:proofErr w:type="spellStart"/>
-      <w:r>
-        <w:rPr>
-          <w:sz w:val="24"/>
-          <w:szCs w:val="24"/>
-        </w:rPr>
-        <w:t>publically</w:t>
-      </w:r>
-      <w:proofErr w:type="spellEnd"/>
+      <w:r>
+        <w:rPr>
+          <w:sz w:val="24"/>
+          <w:szCs w:val="24"/>
+        </w:rPr>
+        <w:t>publicly</w:t>
+      </w:r>
       <w:r>
         <w:rPr>
           <w:sz w:val="24"/>
@@ -10305,15 +10005,13 @@
         </w:rPr>
         <w:t xml:space="preserve">hosted as </w:t>
       </w:r>
-      <w:proofErr w:type="spellStart"/>
-      <w:r>
-        <w:rPr>
-          <w:sz w:val="24"/>
-          <w:szCs w:val="24"/>
-        </w:rPr>
-        <w:t>publically</w:t>
-      </w:r>
-      <w:proofErr w:type="spellEnd"/>
+      <w:r>
+        <w:rPr>
+          <w:sz w:val="24"/>
+          <w:szCs w:val="24"/>
+        </w:rPr>
+        <w:t>publicly</w:t>
+      </w:r>
       <w:r>
         <w:rPr>
           <w:sz w:val="24"/>
@@ -10643,15 +10341,13 @@
         </w:rPr>
         <w:t xml:space="preserve">: Any data that does not fall under open source or public use will be stored locally in secure project folders with access restricted to the analyst account. Sensitive materials will not be shared </w:t>
       </w:r>
-      <w:proofErr w:type="spellStart"/>
-      <w:r>
-        <w:rPr>
-          <w:sz w:val="24"/>
-          <w:szCs w:val="24"/>
-        </w:rPr>
-        <w:t>publically</w:t>
-      </w:r>
-      <w:proofErr w:type="spellEnd"/>
+      <w:r>
+        <w:rPr>
+          <w:sz w:val="24"/>
+          <w:szCs w:val="24"/>
+        </w:rPr>
+        <w:t>publicly</w:t>
+      </w:r>
       <w:r>
         <w:rPr>
           <w:sz w:val="24"/>
@@ -10787,10 +10483,10 @@
     <w:sdt>
       <w:sdtPr>
         <w:rPr>
-          <w:rFonts w:ascii="Times New Roman" w:eastAsia="Times New Roman" w:hAnsi="Times New Roman" w:cs="Times New Roman"/>
+          <w:rFonts w:asciiTheme="minorHAnsi" w:eastAsia="Times New Roman" w:hAnsiTheme="minorHAnsi" w:cstheme="minorHAnsi"/>
           <w:b w:val="0"/>
           <w:bCs w:val="0"/>
-          <w:sz w:val="22"/>
+          <w:sz w:val="24"/>
           <w:szCs w:val="24"/>
         </w:rPr>
         <w:id w:val="890692505"/>
@@ -10804,9 +10500,24 @@
           <w:pPr>
             <w:pStyle w:val="Heading1"/>
             <w:spacing w:line="360" w:lineRule="auto"/>
+            <w:ind w:left="720" w:hanging="720"/>
             <w:jc w:val="center"/>
+            <w:rPr>
+              <w:rFonts w:asciiTheme="minorHAnsi" w:hAnsiTheme="minorHAnsi" w:cstheme="minorHAnsi"/>
+              <w:b w:val="0"/>
+              <w:bCs w:val="0"/>
+              <w:sz w:val="24"/>
+              <w:szCs w:val="24"/>
+            </w:rPr>
           </w:pPr>
           <w:r>
+            <w:rPr>
+              <w:rFonts w:asciiTheme="minorHAnsi" w:hAnsiTheme="minorHAnsi" w:cstheme="minorHAnsi"/>
+              <w:b w:val="0"/>
+              <w:bCs w:val="0"/>
+              <w:sz w:val="24"/>
+              <w:szCs w:val="24"/>
+            </w:rPr>
             <w:t>References</w:t>
           </w:r>
           <w:bookmarkEnd w:id="37"/>
@@ -10814,6 +10525,7 @@
         <w:sdt>
           <w:sdtPr>
             <w:rPr>
+              <w:rFonts w:asciiTheme="minorHAnsi" w:hAnsiTheme="minorHAnsi" w:cstheme="minorHAnsi"/>
               <w:sz w:val="24"/>
               <w:szCs w:val="24"/>
             </w:rPr>
@@ -10824,134 +10536,801 @@
             <w:p>
               <w:pPr>
                 <w:pStyle w:val="Bibliography"/>
-                <w:spacing w:line="360" w:lineRule="auto"/>
                 <w:ind w:left="720" w:hanging="720"/>
                 <w:rPr>
-                  <w:noProof/>
+                  <w:rFonts w:asciiTheme="minorHAnsi" w:hAnsiTheme="minorHAnsi" w:cstheme="minorHAnsi"/>
                   <w:sz w:val="24"/>
                   <w:szCs w:val="24"/>
                 </w:rPr>
               </w:pPr>
               <w:r>
                 <w:rPr>
+                  <w:rFonts w:asciiTheme="minorHAnsi" w:hAnsiTheme="minorHAnsi" w:cstheme="minorHAnsi"/>
                   <w:sz w:val="24"/>
                   <w:szCs w:val="24"/>
                 </w:rPr>
-                <w:fldChar w:fldCharType="begin"/>
+                <w:t xml:space="preserve">Zhou, X., Wang, Y., Lu, Y., &amp; Ting, K. M. (2024). Fast anomaly detection for vision-based industrial inspection using cascades of null subspace PCA detectors. Sensors, 24(3), 1234. </w:t>
               </w:r>
-              <w:r>
+              <w:hyperlink r:id="rId15" w:history="1">
+                <w:r>
+                  <w:rPr>
+                    <w:rStyle w:val="Hyperlink"/>
+                    <w:rFonts w:asciiTheme="minorHAnsi" w:hAnsiTheme="minorHAnsi" w:cstheme="minorHAnsi"/>
+                    <w:sz w:val="24"/>
+                    <w:szCs w:val="24"/>
+                  </w:rPr>
+                  <w:t>https://pmc.ncbi.nlm.nih.gov/articles/PMC12349016/</w:t>
+                </w:r>
+              </w:hyperlink>
+            </w:p>
+            <w:p>
+              <w:pPr>
+                <w:ind w:left="720" w:hanging="720"/>
                 <w:rPr>
+                  <w:rFonts w:asciiTheme="minorHAnsi" w:hAnsiTheme="minorHAnsi" w:cstheme="minorHAnsi"/>
                   <w:sz w:val="24"/>
                   <w:szCs w:val="24"/>
                 </w:rPr>
-                <w:instrText xml:space="preserve"> BIBLIOGRAPHY </w:instrText>
-              </w:r>
-              <w:r>
-                <w:rPr>
-                  <w:sz w:val="24"/>
-                  <w:szCs w:val="24"/>
-                </w:rPr>
-                <w:fldChar w:fldCharType="separate"/>
-              </w:r>
-              <w:r>
-                <w:rPr>
-                  <w:noProof/>
-                  <w:sz w:val="24"/>
-                  <w:szCs w:val="24"/>
-                </w:rPr>
-                <w:t>Purdue University. (n.d.). Retrieved from APA Formatting and Style Guide (7th Edition) - Purdue OWL: https://owl.purdue.edu/owl/research_and_citation/apa_style/apa_formatting_and_style_guide/index.html</w:t>
-              </w:r>
+              </w:pPr>
             </w:p>
             <w:p>
               <w:pPr>
-                <w:pStyle w:val="Bibliography"/>
-                <w:spacing w:line="360" w:lineRule="auto"/>
                 <w:ind w:left="720" w:hanging="720"/>
                 <w:rPr>
-                  <w:noProof/>
+                  <w:rFonts w:asciiTheme="minorHAnsi" w:hAnsiTheme="minorHAnsi" w:cstheme="minorHAnsi"/>
                   <w:sz w:val="24"/>
                   <w:szCs w:val="24"/>
                 </w:rPr>
               </w:pPr>
               <w:r>
                 <w:rPr>
-                  <w:noProof/>
+                  <w:rFonts w:asciiTheme="minorHAnsi" w:hAnsiTheme="minorHAnsi" w:cstheme="minorHAnsi"/>
                   <w:sz w:val="24"/>
                   <w:szCs w:val="24"/>
                 </w:rPr>
-                <w:t xml:space="preserve">Scribbr. (2022, December 21). </w:t>
+                <w:t xml:space="preserve">Gómez, J., Suárez, J., Pantoja, A., &amp; Camargo, J. (2023). An adaptable and unsupervised </w:t>
               </w:r>
+              <w:proofErr w:type="spellStart"/>
               <w:r>
                 <w:rPr>
-                  <w:i/>
-                  <w:iCs/>
-                  <w:noProof/>
+                  <w:rFonts w:asciiTheme="minorHAnsi" w:hAnsiTheme="minorHAnsi" w:cstheme="minorHAnsi"/>
                   <w:sz w:val="24"/>
                   <w:szCs w:val="24"/>
                 </w:rPr>
-                <w:t>Free Citation Generator</w:t>
+                <w:t>TinyML</w:t>
               </w:r>
+              <w:proofErr w:type="spellEnd"/>
               <w:r>
                 <w:rPr>
-                  <w:noProof/>
+                  <w:rFonts w:asciiTheme="minorHAnsi" w:hAnsiTheme="minorHAnsi" w:cstheme="minorHAnsi"/>
                   <w:sz w:val="24"/>
                   <w:szCs w:val="24"/>
                 </w:rPr>
-                <w:t>. Retrieved from Scribbr: https://www.scribbr.com/citation/generator/</w:t>
+                <w:t xml:space="preserve"> anomaly detection system for extreme industrial environments. Sensors, 23(4), 2034. </w:t>
               </w:r>
+              <w:hyperlink r:id="rId16" w:history="1">
+                <w:r>
+                  <w:rPr>
+                    <w:rStyle w:val="Hyperlink"/>
+                    <w:rFonts w:asciiTheme="minorHAnsi" w:hAnsiTheme="minorHAnsi" w:cstheme="minorHAnsi"/>
+                    <w:sz w:val="24"/>
+                    <w:szCs w:val="24"/>
+                  </w:rPr>
+                  <w:t>https://doi.org/10.3390/s23042034</w:t>
+                </w:r>
+              </w:hyperlink>
             </w:p>
             <w:p>
               <w:pPr>
-                <w:pStyle w:val="Bibliography"/>
-                <w:spacing w:line="360" w:lineRule="auto"/>
                 <w:ind w:left="720" w:hanging="720"/>
                 <w:rPr>
-                  <w:noProof/>
+                  <w:rFonts w:asciiTheme="minorHAnsi" w:hAnsiTheme="minorHAnsi" w:cstheme="minorHAnsi"/>
+                  <w:sz w:val="24"/>
+                  <w:szCs w:val="24"/>
+                </w:rPr>
+              </w:pPr>
+            </w:p>
+            <w:p>
+              <w:pPr>
+                <w:ind w:left="720" w:hanging="720"/>
+                <w:rPr>
+                  <w:rFonts w:asciiTheme="minorHAnsi" w:hAnsiTheme="minorHAnsi" w:cstheme="minorHAnsi"/>
                   <w:sz w:val="24"/>
                   <w:szCs w:val="24"/>
                 </w:rPr>
               </w:pPr>
               <w:r>
                 <w:rPr>
-                  <w:noProof/>
+                  <w:rFonts w:asciiTheme="minorHAnsi" w:hAnsiTheme="minorHAnsi" w:cstheme="minorHAnsi"/>
                   <w:sz w:val="24"/>
                   <w:szCs w:val="24"/>
                 </w:rPr>
-                <w:t xml:space="preserve">Smith, J. (2023). A Generic Journal Article Example. </w:t>
+                <w:t xml:space="preserve">Bose, S., Zhang, T., &amp; Ramaswamy, L. (2025). Cascading multi-agent anomaly detection in surveillance systems via vision-language models and embedding-based classification (Version 3). </w:t>
+              </w:r>
+              <w:proofErr w:type="spellStart"/>
+              <w:r>
+                <w:rPr>
+                  <w:rFonts w:asciiTheme="minorHAnsi" w:hAnsiTheme="minorHAnsi" w:cstheme="minorHAnsi"/>
+                  <w:sz w:val="24"/>
+                  <w:szCs w:val="24"/>
+                </w:rPr>
+                <w:t>arXiv</w:t>
+              </w:r>
+              <w:proofErr w:type="spellEnd"/>
+              <w:r>
+                <w:rPr>
+                  <w:rFonts w:asciiTheme="minorHAnsi" w:hAnsiTheme="minorHAnsi" w:cstheme="minorHAnsi"/>
+                  <w:sz w:val="24"/>
+                  <w:szCs w:val="24"/>
+                </w:rPr>
+                <w:t xml:space="preserve">. </w:t>
+              </w:r>
+              <w:hyperlink r:id="rId17" w:history="1">
+                <w:r>
+                  <w:rPr>
+                    <w:rStyle w:val="Hyperlink"/>
+                    <w:rFonts w:asciiTheme="minorHAnsi" w:hAnsiTheme="minorHAnsi" w:cstheme="minorHAnsi"/>
+                    <w:sz w:val="24"/>
+                    <w:szCs w:val="24"/>
+                  </w:rPr>
+                  <w:t>https://arxiv.org/abs/2601.06204</w:t>
+                </w:r>
+              </w:hyperlink>
+            </w:p>
+            <w:p>
+              <w:pPr>
+                <w:ind w:left="720" w:hanging="720"/>
+                <w:rPr>
+                  <w:rFonts w:asciiTheme="minorHAnsi" w:hAnsiTheme="minorHAnsi" w:cstheme="minorHAnsi"/>
+                  <w:sz w:val="24"/>
+                  <w:szCs w:val="24"/>
+                </w:rPr>
+              </w:pPr>
+            </w:p>
+            <w:p>
+              <w:pPr>
+                <w:ind w:left="720" w:hanging="720"/>
+                <w:rPr>
+                  <w:rFonts w:asciiTheme="minorHAnsi" w:hAnsiTheme="minorHAnsi" w:cstheme="minorHAnsi"/>
+                  <w:sz w:val="24"/>
+                  <w:szCs w:val="24"/>
+                </w:rPr>
+              </w:pPr>
+              <w:proofErr w:type="spellStart"/>
+              <w:r>
+                <w:rPr>
+                  <w:rFonts w:asciiTheme="minorHAnsi" w:hAnsiTheme="minorHAnsi" w:cstheme="minorHAnsi"/>
+                  <w:sz w:val="24"/>
+                  <w:szCs w:val="24"/>
+                </w:rPr>
+                <w:t>nphantawee</w:t>
+              </w:r>
+              <w:proofErr w:type="spellEnd"/>
+              <w:r>
+                <w:rPr>
+                  <w:rFonts w:asciiTheme="minorHAnsi" w:hAnsiTheme="minorHAnsi" w:cstheme="minorHAnsi"/>
+                  <w:sz w:val="24"/>
+                  <w:szCs w:val="24"/>
+                </w:rPr>
+                <w:t xml:space="preserve">. (n.d.). </w:t>
               </w:r>
               <w:r>
                 <w:rPr>
+                  <w:rFonts w:asciiTheme="minorHAnsi" w:hAnsiTheme="minorHAnsi" w:cstheme="minorHAnsi"/>
                   <w:i/>
                   <w:iCs/>
-                  <w:noProof/>
                   <w:sz w:val="24"/>
                   <w:szCs w:val="24"/>
                 </w:rPr>
-                <w:t>Generic Journal</w:t>
+                <w:t>Pump sensor data</w:t>
               </w:r>
               <w:r>
                 <w:rPr>
-                  <w:noProof/>
+                  <w:rFonts w:asciiTheme="minorHAnsi" w:hAnsiTheme="minorHAnsi" w:cstheme="minorHAnsi"/>
                   <w:sz w:val="24"/>
                   <w:szCs w:val="24"/>
                 </w:rPr>
-                <w:t>, 50-62.</w:t>
+                <w:t xml:space="preserve"> [Data set]. Kaggle. </w:t>
               </w:r>
+              <w:hyperlink r:id="rId18" w:tgtFrame="_new" w:history="1">
+                <w:r>
+                  <w:rPr>
+                    <w:rStyle w:val="Hyperlink"/>
+                    <w:rFonts w:asciiTheme="minorHAnsi" w:hAnsiTheme="minorHAnsi" w:cstheme="minorHAnsi"/>
+                    <w:sz w:val="24"/>
+                    <w:szCs w:val="24"/>
+                  </w:rPr>
+                  <w:t>https://www.kaggle.com/datasets/nphantawee/pump-sensor-data/data</w:t>
+                </w:r>
+              </w:hyperlink>
             </w:p>
             <w:p>
               <w:pPr>
-                <w:spacing w:line="360" w:lineRule="auto"/>
+                <w:ind w:left="720" w:hanging="720"/>
+                <w:rPr>
+                  <w:rFonts w:asciiTheme="minorHAnsi" w:hAnsiTheme="minorHAnsi" w:cstheme="minorHAnsi"/>
+                  <w:sz w:val="24"/>
+                  <w:szCs w:val="24"/>
+                </w:rPr>
+              </w:pPr>
+            </w:p>
+            <w:p>
+              <w:pPr>
+                <w:ind w:left="720" w:hanging="720"/>
+                <w:rPr>
+                  <w:rFonts w:asciiTheme="minorHAnsi" w:hAnsiTheme="minorHAnsi" w:cstheme="minorHAnsi"/>
+                  <w:sz w:val="24"/>
+                  <w:szCs w:val="24"/>
+                </w:rPr>
+              </w:pPr>
+              <w:proofErr w:type="gramStart"/>
+              <w:r>
+                <w:rPr>
+                  <w:rFonts w:asciiTheme="minorHAnsi" w:hAnsiTheme="minorHAnsi" w:cstheme="minorHAnsi"/>
+                  <w:sz w:val="24"/>
+                  <w:szCs w:val="24"/>
+                </w:rPr>
+                <w:t>pandas</w:t>
+              </w:r>
+              <w:proofErr w:type="gramEnd"/>
+              <w:r>
+                <w:rPr>
+                  <w:rFonts w:asciiTheme="minorHAnsi" w:hAnsiTheme="minorHAnsi" w:cstheme="minorHAnsi"/>
+                  <w:sz w:val="24"/>
+                  <w:szCs w:val="24"/>
+                </w:rPr>
+                <w:t xml:space="preserve"> development team. (n.d.). </w:t>
+              </w:r>
+              <w:proofErr w:type="gramStart"/>
+              <w:r>
+                <w:rPr>
+                  <w:rFonts w:asciiTheme="minorHAnsi" w:hAnsiTheme="minorHAnsi" w:cstheme="minorHAnsi"/>
+                  <w:sz w:val="24"/>
+                  <w:szCs w:val="24"/>
+                </w:rPr>
+                <w:t>Pandas</w:t>
+              </w:r>
+              <w:proofErr w:type="gramEnd"/>
+              <w:r>
+                <w:rPr>
+                  <w:rFonts w:asciiTheme="minorHAnsi" w:hAnsiTheme="minorHAnsi" w:cstheme="minorHAnsi"/>
+                  <w:sz w:val="24"/>
+                  <w:szCs w:val="24"/>
+                </w:rPr>
+                <w:t xml:space="preserve"> user guide. pandas.pydata.org. </w:t>
+              </w:r>
+              <w:hyperlink r:id="rId19" w:tgtFrame="_new" w:history="1">
+                <w:r>
+                  <w:rPr>
+                    <w:rStyle w:val="Hyperlink"/>
+                    <w:rFonts w:asciiTheme="minorHAnsi" w:hAnsiTheme="minorHAnsi" w:cstheme="minorHAnsi"/>
+                    <w:sz w:val="24"/>
+                    <w:szCs w:val="24"/>
+                  </w:rPr>
+                  <w:t>https://pandas.pydata.org/docs/user_guide/index.html</w:t>
+                </w:r>
+              </w:hyperlink>
+            </w:p>
+            <w:p>
+              <w:pPr>
+                <w:ind w:left="720" w:hanging="720"/>
+                <w:rPr>
+                  <w:rFonts w:asciiTheme="minorHAnsi" w:hAnsiTheme="minorHAnsi" w:cstheme="minorHAnsi"/>
+                  <w:sz w:val="24"/>
+                  <w:szCs w:val="24"/>
+                </w:rPr>
+              </w:pPr>
+            </w:p>
+            <w:p>
+              <w:pPr>
+                <w:ind w:left="720" w:hanging="720"/>
+                <w:rPr>
+                  <w:rFonts w:asciiTheme="minorHAnsi" w:hAnsiTheme="minorHAnsi" w:cstheme="minorHAnsi"/>
+                  <w:sz w:val="24"/>
+                  <w:szCs w:val="24"/>
+                </w:rPr>
               </w:pPr>
               <w:r>
                 <w:rPr>
-                  <w:b/>
-                  <w:bCs/>
-                  <w:noProof/>
+                  <w:rFonts w:asciiTheme="minorHAnsi" w:hAnsiTheme="minorHAnsi" w:cstheme="minorHAnsi"/>
                   <w:sz w:val="24"/>
                   <w:szCs w:val="24"/>
                 </w:rPr>
-                <w:fldChar w:fldCharType="end"/>
+                <w:t xml:space="preserve">scikit-learn developers. (n.d.). Outlier detection. scikit-learn.org. </w:t>
               </w:r>
+              <w:hyperlink r:id="rId20" w:history="1">
+                <w:r>
+                  <w:rPr>
+                    <w:rStyle w:val="Hyperlink"/>
+                    <w:rFonts w:asciiTheme="minorHAnsi" w:hAnsiTheme="minorHAnsi" w:cstheme="minorHAnsi"/>
+                    <w:sz w:val="24"/>
+                    <w:szCs w:val="24"/>
+                  </w:rPr>
+                  <w:t>https://scikit-learn.org/stable/modules/outlier_detection.html</w:t>
+                </w:r>
+              </w:hyperlink>
+            </w:p>
+            <w:p>
+              <w:pPr>
+                <w:ind w:left="720" w:hanging="720"/>
+                <w:rPr>
+                  <w:rFonts w:asciiTheme="minorHAnsi" w:hAnsiTheme="minorHAnsi" w:cstheme="minorHAnsi"/>
+                  <w:sz w:val="24"/>
+                  <w:szCs w:val="24"/>
+                </w:rPr>
+              </w:pPr>
+            </w:p>
+            <w:p>
+              <w:pPr>
+                <w:ind w:left="720" w:hanging="720"/>
+                <w:rPr>
+                  <w:rFonts w:asciiTheme="minorHAnsi" w:hAnsiTheme="minorHAnsi" w:cstheme="minorHAnsi"/>
+                  <w:sz w:val="24"/>
+                  <w:szCs w:val="24"/>
+                </w:rPr>
+              </w:pPr>
+              <w:r>
+                <w:rPr>
+                  <w:rFonts w:asciiTheme="minorHAnsi" w:hAnsiTheme="minorHAnsi" w:cstheme="minorHAnsi"/>
+                  <w:sz w:val="24"/>
+                  <w:szCs w:val="24"/>
+                </w:rPr>
+                <w:t xml:space="preserve">scikit-learn developers. (n.d.). Column transformer with mixed types. scikit-learn.org. </w:t>
+              </w:r>
+              <w:hyperlink r:id="rId21" w:tgtFrame="_new" w:history="1">
+                <w:r>
+                  <w:rPr>
+                    <w:rStyle w:val="Hyperlink"/>
+                    <w:rFonts w:asciiTheme="minorHAnsi" w:hAnsiTheme="minorHAnsi" w:cstheme="minorHAnsi"/>
+                    <w:sz w:val="24"/>
+                    <w:szCs w:val="24"/>
+                  </w:rPr>
+                  <w:t>https://scikit-learn.org/stable/modules/compose.html</w:t>
+                </w:r>
+              </w:hyperlink>
+            </w:p>
+            <w:p>
+              <w:pPr>
+                <w:ind w:left="720" w:hanging="720"/>
+                <w:rPr>
+                  <w:rFonts w:asciiTheme="minorHAnsi" w:hAnsiTheme="minorHAnsi" w:cstheme="minorHAnsi"/>
+                  <w:sz w:val="24"/>
+                  <w:szCs w:val="24"/>
+                </w:rPr>
+              </w:pPr>
+            </w:p>
+            <w:p>
+              <w:pPr>
+                <w:ind w:left="720" w:hanging="720"/>
+                <w:rPr>
+                  <w:rFonts w:asciiTheme="minorHAnsi" w:hAnsiTheme="minorHAnsi" w:cstheme="minorHAnsi"/>
+                  <w:sz w:val="24"/>
+                  <w:szCs w:val="24"/>
+                </w:rPr>
+              </w:pPr>
+              <w:r>
+                <w:rPr>
+                  <w:rFonts w:asciiTheme="minorHAnsi" w:hAnsiTheme="minorHAnsi" w:cstheme="minorHAnsi"/>
+                  <w:sz w:val="24"/>
+                  <w:szCs w:val="24"/>
+                </w:rPr>
+                <w:t xml:space="preserve">Weights &amp; Biases. (n.d.). Artifacts. </w:t>
+              </w:r>
+              <w:hyperlink r:id="rId22" w:tgtFrame="_new" w:history="1">
+                <w:r>
+                  <w:rPr>
+                    <w:rStyle w:val="Hyperlink"/>
+                    <w:rFonts w:asciiTheme="minorHAnsi" w:hAnsiTheme="minorHAnsi" w:cstheme="minorHAnsi"/>
+                    <w:sz w:val="24"/>
+                    <w:szCs w:val="24"/>
+                  </w:rPr>
+                  <w:t>https://docs.wandb.ai/guides/artifacts</w:t>
+                </w:r>
+              </w:hyperlink>
+            </w:p>
+            <w:p>
+              <w:pPr>
+                <w:ind w:left="720" w:hanging="720"/>
+                <w:rPr>
+                  <w:rFonts w:asciiTheme="minorHAnsi" w:hAnsiTheme="minorHAnsi" w:cstheme="minorHAnsi"/>
+                  <w:sz w:val="24"/>
+                  <w:szCs w:val="24"/>
+                </w:rPr>
+              </w:pPr>
+            </w:p>
+            <w:p>
+              <w:pPr>
+                <w:ind w:left="720" w:hanging="720"/>
+                <w:rPr>
+                  <w:rFonts w:asciiTheme="minorHAnsi" w:hAnsiTheme="minorHAnsi" w:cstheme="minorHAnsi"/>
+                  <w:sz w:val="24"/>
+                  <w:szCs w:val="24"/>
+                </w:rPr>
+              </w:pPr>
+              <w:r>
+                <w:rPr>
+                  <w:rFonts w:asciiTheme="minorHAnsi" w:hAnsiTheme="minorHAnsi" w:cstheme="minorHAnsi"/>
+                  <w:sz w:val="24"/>
+                  <w:szCs w:val="24"/>
+                </w:rPr>
+                <w:t xml:space="preserve">Dworkin, R., &amp; contributors. (n.d.). </w:t>
+              </w:r>
+              <w:proofErr w:type="spellStart"/>
+              <w:r>
+                <w:rPr>
+                  <w:rFonts w:asciiTheme="minorHAnsi" w:hAnsiTheme="minorHAnsi" w:cstheme="minorHAnsi"/>
+                  <w:sz w:val="24"/>
+                  <w:szCs w:val="24"/>
+                </w:rPr>
+                <w:t>kafka</w:t>
+              </w:r>
+              <w:proofErr w:type="spellEnd"/>
+              <w:r>
+                <w:rPr>
+                  <w:rFonts w:asciiTheme="minorHAnsi" w:hAnsiTheme="minorHAnsi" w:cstheme="minorHAnsi"/>
+                  <w:sz w:val="24"/>
+                  <w:szCs w:val="24"/>
+                </w:rPr>
+                <w:t xml:space="preserve">-python documentation. Read the Docs. </w:t>
+              </w:r>
+              <w:hyperlink r:id="rId23" w:tgtFrame="_new" w:history="1">
+                <w:r>
+                  <w:rPr>
+                    <w:rStyle w:val="Hyperlink"/>
+                    <w:rFonts w:asciiTheme="minorHAnsi" w:hAnsiTheme="minorHAnsi" w:cstheme="minorHAnsi"/>
+                    <w:sz w:val="24"/>
+                    <w:szCs w:val="24"/>
+                  </w:rPr>
+                  <w:t>https://kafka-python.readthedocs.io/en/master/</w:t>
+                </w:r>
+              </w:hyperlink>
+            </w:p>
+            <w:p>
+              <w:pPr>
+                <w:ind w:left="720" w:hanging="720"/>
+                <w:rPr>
+                  <w:rFonts w:asciiTheme="minorHAnsi" w:hAnsiTheme="minorHAnsi" w:cstheme="minorHAnsi"/>
+                  <w:sz w:val="24"/>
+                  <w:szCs w:val="24"/>
+                </w:rPr>
+              </w:pPr>
+            </w:p>
+            <w:p>
+              <w:pPr>
+                <w:ind w:left="720" w:hanging="720"/>
+                <w:rPr>
+                  <w:rFonts w:asciiTheme="minorHAnsi" w:hAnsiTheme="minorHAnsi" w:cstheme="minorHAnsi"/>
+                  <w:sz w:val="24"/>
+                  <w:szCs w:val="24"/>
+                </w:rPr>
+              </w:pPr>
+              <w:r>
+                <w:rPr>
+                  <w:rFonts w:asciiTheme="minorHAnsi" w:hAnsiTheme="minorHAnsi" w:cstheme="minorHAnsi"/>
+                  <w:sz w:val="24"/>
+                  <w:szCs w:val="24"/>
+                </w:rPr>
+                <w:t xml:space="preserve">Confluent. (n.d.). Python clients for Apache Kafka. </w:t>
+              </w:r>
+              <w:hyperlink r:id="rId24" w:tgtFrame="_new" w:history="1">
+                <w:r>
+                  <w:rPr>
+                    <w:rStyle w:val="Hyperlink"/>
+                    <w:rFonts w:asciiTheme="minorHAnsi" w:hAnsiTheme="minorHAnsi" w:cstheme="minorHAnsi"/>
+                    <w:sz w:val="24"/>
+                    <w:szCs w:val="24"/>
+                  </w:rPr>
+                  <w:t>https://docs.confluent.io/platform/current/clients/python.html</w:t>
+                </w:r>
+              </w:hyperlink>
+            </w:p>
+            <w:p>
+              <w:pPr>
+                <w:ind w:left="720" w:hanging="720"/>
+                <w:rPr>
+                  <w:rFonts w:asciiTheme="minorHAnsi" w:hAnsiTheme="minorHAnsi" w:cstheme="minorHAnsi"/>
+                  <w:sz w:val="24"/>
+                  <w:szCs w:val="24"/>
+                </w:rPr>
+              </w:pPr>
+            </w:p>
+            <w:p>
+              <w:pPr>
+                <w:ind w:left="720" w:hanging="720"/>
+                <w:rPr>
+                  <w:rFonts w:asciiTheme="minorHAnsi" w:hAnsiTheme="minorHAnsi" w:cstheme="minorHAnsi"/>
+                  <w:sz w:val="24"/>
+                  <w:szCs w:val="24"/>
+                </w:rPr>
+              </w:pPr>
+              <w:r>
+                <w:rPr>
+                  <w:rFonts w:asciiTheme="minorHAnsi" w:hAnsiTheme="minorHAnsi" w:cstheme="minorHAnsi"/>
+                  <w:sz w:val="24"/>
+                  <w:szCs w:val="24"/>
+                </w:rPr>
+                <w:t xml:space="preserve">Docker, Inc. (n.d.). Develop with Docker: Best practices. </w:t>
+              </w:r>
+              <w:hyperlink r:id="rId25" w:tgtFrame="_new" w:history="1">
+                <w:r>
+                  <w:rPr>
+                    <w:rStyle w:val="Hyperlink"/>
+                    <w:rFonts w:asciiTheme="minorHAnsi" w:hAnsiTheme="minorHAnsi" w:cstheme="minorHAnsi"/>
+                    <w:sz w:val="24"/>
+                    <w:szCs w:val="24"/>
+                  </w:rPr>
+                  <w:t>https://docs.docker.com/develop/</w:t>
+                </w:r>
+              </w:hyperlink>
+            </w:p>
+            <w:p>
+              <w:pPr>
+                <w:ind w:left="720" w:hanging="720"/>
+                <w:rPr>
+                  <w:rFonts w:asciiTheme="minorHAnsi" w:hAnsiTheme="minorHAnsi" w:cstheme="minorHAnsi"/>
+                  <w:sz w:val="24"/>
+                  <w:szCs w:val="24"/>
+                </w:rPr>
+              </w:pPr>
+            </w:p>
+            <w:p>
+              <w:pPr>
+                <w:ind w:left="720" w:hanging="720"/>
+                <w:rPr>
+                  <w:rFonts w:asciiTheme="minorHAnsi" w:hAnsiTheme="minorHAnsi" w:cstheme="minorHAnsi"/>
+                  <w:sz w:val="24"/>
+                  <w:szCs w:val="24"/>
+                </w:rPr>
+              </w:pPr>
+              <w:r>
+                <w:rPr>
+                  <w:rFonts w:asciiTheme="minorHAnsi" w:hAnsiTheme="minorHAnsi" w:cstheme="minorHAnsi"/>
+                  <w:sz w:val="24"/>
+                  <w:szCs w:val="24"/>
+                </w:rPr>
+                <w:t xml:space="preserve">Himeur, Y., Sun, Y., &amp; Ghanem, K. (2021). Hybrid anomaly detection in industrial IoT systems. </w:t>
+              </w:r>
+              <w:proofErr w:type="spellStart"/>
+              <w:r>
+                <w:rPr>
+                  <w:rFonts w:asciiTheme="minorHAnsi" w:hAnsiTheme="minorHAnsi" w:cstheme="minorHAnsi"/>
+                  <w:sz w:val="24"/>
+                  <w:szCs w:val="24"/>
+                </w:rPr>
+                <w:t>arXiv</w:t>
+              </w:r>
+              <w:proofErr w:type="spellEnd"/>
+              <w:r>
+                <w:rPr>
+                  <w:rFonts w:asciiTheme="minorHAnsi" w:hAnsiTheme="minorHAnsi" w:cstheme="minorHAnsi"/>
+                  <w:sz w:val="24"/>
+                  <w:szCs w:val="24"/>
+                </w:rPr>
+                <w:t xml:space="preserve">. </w:t>
+              </w:r>
+              <w:hyperlink r:id="rId26" w:tgtFrame="_new" w:history="1">
+                <w:r>
+                  <w:rPr>
+                    <w:rStyle w:val="Hyperlink"/>
+                    <w:rFonts w:asciiTheme="minorHAnsi" w:hAnsiTheme="minorHAnsi" w:cstheme="minorHAnsi"/>
+                    <w:sz w:val="24"/>
+                    <w:szCs w:val="24"/>
+                  </w:rPr>
+                  <w:t>https://arxiv.org/abs/2103.11320</w:t>
+                </w:r>
+              </w:hyperlink>
+            </w:p>
+            <w:p>
+              <w:pPr>
+                <w:ind w:left="720" w:hanging="720"/>
+                <w:rPr>
+                  <w:rFonts w:asciiTheme="minorHAnsi" w:hAnsiTheme="minorHAnsi" w:cstheme="minorHAnsi"/>
+                  <w:sz w:val="24"/>
+                  <w:szCs w:val="24"/>
+                </w:rPr>
+              </w:pPr>
+            </w:p>
+            <w:p>
+              <w:pPr>
+                <w:ind w:left="720" w:hanging="720"/>
+                <w:rPr>
+                  <w:rFonts w:asciiTheme="minorHAnsi" w:hAnsiTheme="minorHAnsi" w:cstheme="minorHAnsi"/>
+                  <w:sz w:val="24"/>
+                  <w:szCs w:val="24"/>
+                </w:rPr>
+              </w:pPr>
+              <w:r>
+                <w:rPr>
+                  <w:rFonts w:asciiTheme="minorHAnsi" w:hAnsiTheme="minorHAnsi" w:cstheme="minorHAnsi"/>
+                  <w:sz w:val="24"/>
+                  <w:szCs w:val="24"/>
+                </w:rPr>
+                <w:t xml:space="preserve">He, S., Vahdat, V., &amp; Schmid, F. (2021). Cascading machine learning models for fault detection in industrial processes. Reliability Engineering &amp; System Safety, 209, 107470. </w:t>
+              </w:r>
+              <w:hyperlink r:id="rId27" w:tgtFrame="_new" w:history="1">
+                <w:r>
+                  <w:rPr>
+                    <w:rStyle w:val="Hyperlink"/>
+                    <w:rFonts w:asciiTheme="minorHAnsi" w:hAnsiTheme="minorHAnsi" w:cstheme="minorHAnsi"/>
+                    <w:sz w:val="24"/>
+                    <w:szCs w:val="24"/>
+                  </w:rPr>
+                  <w:t>https://www.sciencedirect.com/science/article/abs/pii/S0951832020305359</w:t>
+                </w:r>
+              </w:hyperlink>
+            </w:p>
+            <w:p>
+              <w:pPr>
+                <w:ind w:left="720" w:hanging="720"/>
+                <w:rPr>
+                  <w:rFonts w:asciiTheme="minorHAnsi" w:hAnsiTheme="minorHAnsi" w:cstheme="minorHAnsi"/>
+                  <w:sz w:val="24"/>
+                  <w:szCs w:val="24"/>
+                </w:rPr>
+              </w:pPr>
+            </w:p>
+            <w:p>
+              <w:pPr>
+                <w:ind w:left="720" w:hanging="720"/>
+                <w:rPr>
+                  <w:rFonts w:asciiTheme="minorHAnsi" w:hAnsiTheme="minorHAnsi" w:cstheme="minorHAnsi"/>
+                  <w:sz w:val="24"/>
+                  <w:szCs w:val="24"/>
+                </w:rPr>
+              </w:pPr>
+              <w:r>
+                <w:rPr>
+                  <w:rFonts w:asciiTheme="minorHAnsi" w:hAnsiTheme="minorHAnsi" w:cstheme="minorHAnsi"/>
+                  <w:sz w:val="24"/>
+                  <w:szCs w:val="24"/>
+                </w:rPr>
+                <w:t xml:space="preserve">Ahmad, S., Purdy, S., Lavin, A., &amp; Agha, G. (2019). Evaluating real-time anomaly detection algorithms – The </w:t>
+              </w:r>
+              <w:proofErr w:type="spellStart"/>
+              <w:r>
+                <w:rPr>
+                  <w:rFonts w:asciiTheme="minorHAnsi" w:hAnsiTheme="minorHAnsi" w:cstheme="minorHAnsi"/>
+                  <w:sz w:val="24"/>
+                  <w:szCs w:val="24"/>
+                </w:rPr>
+                <w:t>Numenta</w:t>
+              </w:r>
+              <w:proofErr w:type="spellEnd"/>
+              <w:r>
+                <w:rPr>
+                  <w:rFonts w:asciiTheme="minorHAnsi" w:hAnsiTheme="minorHAnsi" w:cstheme="minorHAnsi"/>
+                  <w:sz w:val="24"/>
+                  <w:szCs w:val="24"/>
+                </w:rPr>
+                <w:t xml:space="preserve"> anomaly benchmark. </w:t>
+              </w:r>
+              <w:proofErr w:type="spellStart"/>
+              <w:r>
+                <w:rPr>
+                  <w:rFonts w:asciiTheme="minorHAnsi" w:hAnsiTheme="minorHAnsi" w:cstheme="minorHAnsi"/>
+                  <w:sz w:val="24"/>
+                  <w:szCs w:val="24"/>
+                </w:rPr>
+                <w:t>arXiv</w:t>
+              </w:r>
+              <w:proofErr w:type="spellEnd"/>
+              <w:r>
+                <w:rPr>
+                  <w:rFonts w:asciiTheme="minorHAnsi" w:hAnsiTheme="minorHAnsi" w:cstheme="minorHAnsi"/>
+                  <w:sz w:val="24"/>
+                  <w:szCs w:val="24"/>
+                </w:rPr>
+                <w:t xml:space="preserve">. </w:t>
+              </w:r>
+              <w:hyperlink r:id="rId28" w:tgtFrame="_new" w:history="1">
+                <w:r>
+                  <w:rPr>
+                    <w:rStyle w:val="Hyperlink"/>
+                    <w:rFonts w:asciiTheme="minorHAnsi" w:hAnsiTheme="minorHAnsi" w:cstheme="minorHAnsi"/>
+                    <w:sz w:val="24"/>
+                    <w:szCs w:val="24"/>
+                  </w:rPr>
+                  <w:t>https://arxiv.org/abs/1906.03821</w:t>
+                </w:r>
+              </w:hyperlink>
+            </w:p>
+            <w:p>
+              <w:pPr>
+                <w:ind w:left="720" w:hanging="720"/>
+                <w:rPr>
+                  <w:rFonts w:asciiTheme="minorHAnsi" w:hAnsiTheme="minorHAnsi" w:cstheme="minorHAnsi"/>
+                  <w:sz w:val="24"/>
+                  <w:szCs w:val="24"/>
+                </w:rPr>
+              </w:pPr>
+            </w:p>
+            <w:p>
+              <w:pPr>
+                <w:ind w:left="720" w:hanging="720"/>
+                <w:rPr>
+                  <w:rFonts w:asciiTheme="minorHAnsi" w:hAnsiTheme="minorHAnsi" w:cstheme="minorHAnsi"/>
+                  <w:sz w:val="24"/>
+                  <w:szCs w:val="24"/>
+                </w:rPr>
+              </w:pPr>
+              <w:r>
+                <w:rPr>
+                  <w:rFonts w:asciiTheme="minorHAnsi" w:hAnsiTheme="minorHAnsi" w:cstheme="minorHAnsi"/>
+                  <w:sz w:val="24"/>
+                  <w:szCs w:val="24"/>
+                </w:rPr>
+                <w:t xml:space="preserve">Zhang, X., Wang, L., &amp; Wang, P. (2019). Combining statistical profiles with machine learning for industrial condition monitoring. Sensors, 19(21), 4734. </w:t>
+              </w:r>
+              <w:hyperlink r:id="rId29" w:tgtFrame="_new" w:history="1">
+                <w:r>
+                  <w:rPr>
+                    <w:rStyle w:val="Hyperlink"/>
+                    <w:rFonts w:asciiTheme="minorHAnsi" w:hAnsiTheme="minorHAnsi" w:cstheme="minorHAnsi"/>
+                    <w:sz w:val="24"/>
+                    <w:szCs w:val="24"/>
+                  </w:rPr>
+                  <w:t>https://www.mdpi.com/1424-8220/19/21/4734</w:t>
+                </w:r>
+              </w:hyperlink>
+            </w:p>
+            <w:p>
+              <w:pPr>
+                <w:ind w:left="720" w:hanging="720"/>
+                <w:rPr>
+                  <w:rFonts w:asciiTheme="minorHAnsi" w:hAnsiTheme="minorHAnsi" w:cstheme="minorHAnsi"/>
+                  <w:sz w:val="24"/>
+                  <w:szCs w:val="24"/>
+                </w:rPr>
+              </w:pPr>
+            </w:p>
+            <w:p>
+              <w:pPr>
+                <w:ind w:left="720" w:hanging="720"/>
+                <w:rPr>
+                  <w:rFonts w:asciiTheme="minorHAnsi" w:hAnsiTheme="minorHAnsi" w:cstheme="minorHAnsi"/>
+                  <w:sz w:val="24"/>
+                  <w:szCs w:val="24"/>
+                </w:rPr>
+              </w:pPr>
+              <w:r>
+                <w:rPr>
+                  <w:rFonts w:asciiTheme="minorHAnsi" w:hAnsiTheme="minorHAnsi" w:cstheme="minorHAnsi"/>
+                  <w:sz w:val="24"/>
+                  <w:szCs w:val="24"/>
+                </w:rPr>
+                <w:t xml:space="preserve">Tam, K.-Y., &amp; Nguyen, D. T. (1995). Expert-system rule validation for anomaly alarms. IEEE Transactions on Systems, Man, and Cybernetics, 25(2), 309–319. </w:t>
+              </w:r>
+              <w:hyperlink r:id="rId30" w:tgtFrame="_new" w:history="1">
+                <w:r>
+                  <w:rPr>
+                    <w:rStyle w:val="Hyperlink"/>
+                    <w:rFonts w:asciiTheme="minorHAnsi" w:hAnsiTheme="minorHAnsi" w:cstheme="minorHAnsi"/>
+                    <w:sz w:val="24"/>
+                    <w:szCs w:val="24"/>
+                  </w:rPr>
+                  <w:t>https://ieeexplore.ieee.org/document/494139/</w:t>
+                </w:r>
+              </w:hyperlink>
+            </w:p>
+            <w:p>
+              <w:pPr>
+                <w:ind w:left="720" w:hanging="720"/>
+                <w:rPr>
+                  <w:rFonts w:asciiTheme="minorHAnsi" w:hAnsiTheme="minorHAnsi" w:cstheme="minorHAnsi"/>
+                  <w:sz w:val="24"/>
+                  <w:szCs w:val="24"/>
+                </w:rPr>
+              </w:pPr>
+            </w:p>
+            <w:p>
+              <w:pPr>
+                <w:ind w:left="720" w:hanging="720"/>
+                <w:rPr>
+                  <w:rFonts w:asciiTheme="minorHAnsi" w:hAnsiTheme="minorHAnsi" w:cstheme="minorHAnsi"/>
+                  <w:sz w:val="24"/>
+                  <w:szCs w:val="24"/>
+                </w:rPr>
+              </w:pPr>
             </w:p>
           </w:sdtContent>
         </w:sdt>
@@ -10969,293 +11348,14 @@
     <w:p>
       <w:pPr>
         <w:spacing w:line="360" w:lineRule="auto"/>
-        <w:ind w:left="720" w:hanging="720"/>
-        <w:rPr>
-          <w:sz w:val="24"/>
-          <w:szCs w:val="24"/>
-        </w:rPr>
-      </w:pPr>
-      <w:r>
-        <w:br w:type="page"/>
-      </w:r>
-    </w:p>
-    <w:p>
-      <w:pPr>
-        <w:pStyle w:val="Heading1"/>
-        <w:spacing w:line="360" w:lineRule="auto"/>
-        <w:jc w:val="center"/>
-        <w:rPr>
-          <w:rFonts w:ascii="Times New Roman" w:eastAsia="Times New Roman" w:hAnsi="Times New Roman" w:cs="Times New Roman"/>
-          <w:b w:val="0"/>
-          <w:bCs w:val="0"/>
-        </w:rPr>
-      </w:pPr>
-      <w:bookmarkStart w:id="38" w:name="_heading=h.2bn6wsx"/>
-      <w:bookmarkStart w:id="39" w:name="_Toc1046046101"/>
-      <w:bookmarkEnd w:id="38"/>
-      <w:r>
-        <w:rPr>
-          <w:b w:val="0"/>
-          <w:bCs w:val="0"/>
-        </w:rPr>
-        <w:lastRenderedPageBreak/>
-        <w:t>Appendix A</w:t>
-      </w:r>
-      <w:bookmarkEnd w:id="39"/>
-    </w:p>
-    <w:p>
-      <w:pPr>
-        <w:pStyle w:val="Heading1"/>
-        <w:spacing w:line="360" w:lineRule="auto"/>
-        <w:jc w:val="center"/>
-        <w:rPr>
-          <w:rFonts w:ascii="Times New Roman" w:eastAsia="Times New Roman" w:hAnsi="Times New Roman" w:cs="Times New Roman"/>
-          <w:b w:val="0"/>
-          <w:bCs w:val="0"/>
-        </w:rPr>
-      </w:pPr>
-      <w:bookmarkStart w:id="40" w:name="_heading=h.qsh70q"/>
-      <w:bookmarkStart w:id="41" w:name="_Toc804972029"/>
-      <w:bookmarkEnd w:id="40"/>
-      <w:r>
-        <w:rPr>
-          <w:rFonts w:ascii="Times New Roman" w:eastAsia="Times New Roman" w:hAnsi="Times New Roman" w:cs="Times New Roman"/>
-          <w:b w:val="0"/>
-          <w:bCs w:val="0"/>
-        </w:rPr>
-        <w:t>Title of Appendix</w:t>
-      </w:r>
-      <w:bookmarkEnd w:id="41"/>
-    </w:p>
-    <w:p>
-      <w:pPr>
-        <w:spacing w:line="360" w:lineRule="auto"/>
-        <w:rPr>
-          <w:sz w:val="24"/>
-          <w:szCs w:val="24"/>
-        </w:rPr>
-      </w:pPr>
-      <w:r>
-        <w:rPr>
-          <w:sz w:val="24"/>
-          <w:szCs w:val="24"/>
-        </w:rPr>
-        <w:t>Put any supporting material in these appendices. Add additional or delete superfluous appendices as needed.</w:t>
-      </w:r>
-      <w:r>
-        <w:br w:type="page"/>
-      </w:r>
-    </w:p>
-    <w:p>
-      <w:pPr>
-        <w:pStyle w:val="Heading1"/>
-        <w:spacing w:line="360" w:lineRule="auto"/>
-        <w:jc w:val="center"/>
-        <w:rPr>
-          <w:b w:val="0"/>
-          <w:bCs w:val="0"/>
-        </w:rPr>
-      </w:pPr>
-      <w:bookmarkStart w:id="42" w:name="_heading=h.3as4poj"/>
-      <w:bookmarkStart w:id="43" w:name="_Toc128761729"/>
-      <w:bookmarkEnd w:id="42"/>
-      <w:r>
-        <w:rPr>
-          <w:b w:val="0"/>
-          <w:bCs w:val="0"/>
-        </w:rPr>
-        <w:lastRenderedPageBreak/>
-        <w:t>Appendix B</w:t>
-      </w:r>
-      <w:bookmarkEnd w:id="43"/>
-    </w:p>
-    <w:p>
-      <w:pPr>
-        <w:pStyle w:val="Heading1"/>
-        <w:spacing w:line="360" w:lineRule="auto"/>
-        <w:jc w:val="center"/>
-        <w:rPr>
-          <w:rFonts w:ascii="Times New Roman" w:eastAsia="Times New Roman" w:hAnsi="Times New Roman" w:cs="Times New Roman"/>
-          <w:b w:val="0"/>
-          <w:bCs w:val="0"/>
-        </w:rPr>
-      </w:pPr>
-      <w:bookmarkStart w:id="44" w:name="_heading=h.1pxezwc"/>
-      <w:bookmarkStart w:id="45" w:name="_Toc1200922991"/>
-      <w:bookmarkEnd w:id="44"/>
-      <w:r>
-        <w:rPr>
-          <w:rFonts w:ascii="Times New Roman" w:eastAsia="Times New Roman" w:hAnsi="Times New Roman" w:cs="Times New Roman"/>
-          <w:b w:val="0"/>
-          <w:bCs w:val="0"/>
-        </w:rPr>
-        <w:t>Title of Appendix</w:t>
-      </w:r>
-      <w:bookmarkEnd w:id="45"/>
-    </w:p>
-    <w:p>
-      <w:pPr>
-        <w:spacing w:line="360" w:lineRule="auto"/>
-        <w:rPr>
-          <w:b/>
-          <w:sz w:val="24"/>
-          <w:szCs w:val="24"/>
-        </w:rPr>
-      </w:pPr>
-      <w:r>
-        <w:rPr>
-          <w:sz w:val="24"/>
-          <w:szCs w:val="24"/>
-        </w:rPr>
-        <w:t>Put any supporting material in these appendices. Add additional or delete superfluous appendices as needed.</w:t>
-      </w:r>
-      <w:r>
-        <w:br w:type="page"/>
-      </w:r>
-    </w:p>
-    <w:p>
-      <w:pPr>
-        <w:pStyle w:val="Heading1"/>
-        <w:spacing w:line="360" w:lineRule="auto"/>
-        <w:jc w:val="center"/>
-        <w:rPr>
-          <w:rFonts w:ascii="Times New Roman" w:eastAsia="Times New Roman" w:hAnsi="Times New Roman" w:cs="Times New Roman"/>
-          <w:b w:val="0"/>
-          <w:bCs w:val="0"/>
-        </w:rPr>
-      </w:pPr>
-      <w:bookmarkStart w:id="46" w:name="_heading=h.49x2ik5"/>
-      <w:bookmarkStart w:id="47" w:name="_Toc1897962072"/>
-      <w:bookmarkEnd w:id="46"/>
-      <w:r>
-        <w:rPr>
-          <w:b w:val="0"/>
-          <w:bCs w:val="0"/>
-        </w:rPr>
-        <w:lastRenderedPageBreak/>
-        <w:t>Appendix C</w:t>
-      </w:r>
-      <w:bookmarkEnd w:id="47"/>
-    </w:p>
-    <w:p>
-      <w:pPr>
-        <w:pStyle w:val="Heading1"/>
-        <w:spacing w:line="360" w:lineRule="auto"/>
-        <w:jc w:val="center"/>
-        <w:rPr>
-          <w:rFonts w:ascii="Times New Roman" w:eastAsia="Times New Roman" w:hAnsi="Times New Roman" w:cs="Times New Roman"/>
-          <w:b w:val="0"/>
-          <w:bCs w:val="0"/>
-        </w:rPr>
-      </w:pPr>
-      <w:bookmarkStart w:id="48" w:name="_heading=h.2p2csry"/>
-      <w:bookmarkStart w:id="49" w:name="_Toc1862588384"/>
-      <w:bookmarkEnd w:id="48"/>
-      <w:r>
-        <w:rPr>
-          <w:rFonts w:ascii="Times New Roman" w:eastAsia="Times New Roman" w:hAnsi="Times New Roman" w:cs="Times New Roman"/>
-          <w:b w:val="0"/>
-          <w:bCs w:val="0"/>
-        </w:rPr>
-        <w:t>Title of Appendix</w:t>
-      </w:r>
-      <w:bookmarkEnd w:id="49"/>
-    </w:p>
-    <w:p>
-      <w:pPr>
-        <w:spacing w:line="360" w:lineRule="auto"/>
-        <w:rPr>
-          <w:b/>
-          <w:sz w:val="24"/>
-          <w:szCs w:val="24"/>
-        </w:rPr>
-      </w:pPr>
-      <w:r>
-        <w:rPr>
-          <w:sz w:val="24"/>
-          <w:szCs w:val="24"/>
-        </w:rPr>
-        <w:t>Put any supporting material in these appendices. Add additional or delete superfluous appendices as needed.</w:t>
-      </w:r>
-      <w:r>
-        <w:br w:type="page"/>
-      </w:r>
-    </w:p>
-    <w:p>
-      <w:pPr>
-        <w:pStyle w:val="Heading1"/>
-        <w:spacing w:line="360" w:lineRule="auto"/>
-        <w:jc w:val="center"/>
-        <w:rPr>
-          <w:rFonts w:ascii="Times New Roman" w:eastAsia="Times New Roman" w:hAnsi="Times New Roman" w:cs="Times New Roman"/>
-          <w:b w:val="0"/>
-          <w:bCs w:val="0"/>
-        </w:rPr>
-      </w:pPr>
-      <w:bookmarkStart w:id="50" w:name="_heading=h.147n2zr"/>
-      <w:bookmarkStart w:id="51" w:name="_Toc1292381938"/>
-      <w:bookmarkEnd w:id="50"/>
-      <w:r>
-        <w:rPr>
-          <w:b w:val="0"/>
-          <w:bCs w:val="0"/>
-        </w:rPr>
-        <w:lastRenderedPageBreak/>
-        <w:t>Appendix D</w:t>
-      </w:r>
-      <w:bookmarkEnd w:id="51"/>
-    </w:p>
-    <w:p>
-      <w:pPr>
-        <w:pStyle w:val="Heading1"/>
-        <w:spacing w:line="360" w:lineRule="auto"/>
-        <w:jc w:val="center"/>
-        <w:rPr>
-          <w:rFonts w:ascii="Times New Roman" w:eastAsia="Times New Roman" w:hAnsi="Times New Roman" w:cs="Times New Roman"/>
-          <w:b w:val="0"/>
-          <w:bCs w:val="0"/>
-        </w:rPr>
-      </w:pPr>
-      <w:bookmarkStart w:id="52" w:name="_heading=h.3o7alnk"/>
-      <w:bookmarkStart w:id="53" w:name="_Toc390418831"/>
-      <w:bookmarkEnd w:id="52"/>
-      <w:r>
-        <w:rPr>
-          <w:rFonts w:ascii="Times New Roman" w:eastAsia="Times New Roman" w:hAnsi="Times New Roman" w:cs="Times New Roman"/>
-          <w:b w:val="0"/>
-          <w:bCs w:val="0"/>
-        </w:rPr>
-        <w:t>T</w:t>
-      </w:r>
-      <w:r>
-        <w:rPr>
-          <w:rFonts w:ascii="Times New Roman" w:eastAsia="Times New Roman" w:hAnsi="Times New Roman" w:cs="Times New Roman"/>
-          <w:b w:val="0"/>
-          <w:bCs w:val="0"/>
-        </w:rPr>
-        <w:t>itle of Appendix</w:t>
-      </w:r>
-      <w:bookmarkEnd w:id="53"/>
-    </w:p>
-    <w:p>
-      <w:pPr>
-        <w:spacing w:line="360" w:lineRule="auto"/>
-        <w:rPr>
-          <w:b/>
-          <w:sz w:val="24"/>
-          <w:szCs w:val="24"/>
-        </w:rPr>
-      </w:pPr>
-      <w:r>
-        <w:rPr>
-          <w:sz w:val="24"/>
-          <w:szCs w:val="24"/>
-        </w:rPr>
-        <w:t>Put any supporting material in these appendices. Add additional or delete superfluous appendices as needed.</w:t>
-      </w:r>
+        <w:rPr>
+          <w:sz w:val="24"/>
+          <w:szCs w:val="24"/>
+        </w:rPr>
+      </w:pPr>
     </w:p>
     <w:sectPr>
-      <w:headerReference w:type="default" r:id="rId15"/>
+      <w:headerReference w:type="default" r:id="rId31"/>
       <w:pgSz w:w="12240" w:h="15840"/>
       <w:pgMar w:top="1440" w:right="1440" w:bottom="1440" w:left="1440" w:header="720" w:footer="720" w:gutter="0"/>
       <w:cols w:space="720"/>
@@ -16563,7 +16663,6 @@
     <w:basedOn w:val="Normal"/>
     <w:next w:val="Normal"/>
     <w:uiPriority w:val="9"/>
-    <w:semiHidden/>
     <w:unhideWhenUsed/>
     <w:qFormat/>
     <w:pPr>
@@ -17329,21 +17428,6 @@
 </file>
 
 <file path=customXml/item2.xml><?xml version="1.0" encoding="utf-8"?>
-<?mso-contentType ?>
-<FormTemplates xmlns="http://schemas.microsoft.com/sharepoint/v3/contenttype/forms">
-  <Display>DocumentLibraryForm</Display>
-  <Edit>DocumentLibraryForm</Edit>
-  <New>DocumentLibraryForm</New>
-</FormTemplates>
-</file>
-
-<file path=customXml/item3.xml><?xml version="1.0" encoding="utf-8"?>
-<go:gDocsCustomXmlDataStorage xmlns:go="http://customooxmlschemas.google.com/" xmlns:r="http://schemas.openxmlformats.org/officeDocument/2006/relationships">
-  <go:docsCustomData xmlns:go="http://customooxmlschemas.google.com/" roundtripDataSignature="AMtx7mi9hMm1w2n+Vt6hN/m6X//z+ToJ7Q==">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</go:docsCustomData>
-</go:gDocsCustomXmlDataStorage>
-</file>
-
-<file path=customXml/item4.xml><?xml version="1.0" encoding="utf-8"?>
 <ct:contentTypeSchema xmlns:ct="http://schemas.microsoft.com/office/2006/metadata/contentType" xmlns:ma="http://schemas.microsoft.com/office/2006/metadata/properties/metaAttributes" ct:_="" ma:_="" ma:contentTypeName="Document" ma:contentTypeID="0x010100BD6C6811FDA4354DADCD440B75A43D37" ma:contentTypeVersion="3" ma:contentTypeDescription="Create a new document." ma:contentTypeScope="" ma:versionID="c37f1311c2859ad141e22abf422a569b">
   <xsd:schema xmlns:xsd="http://www.w3.org/2001/XMLSchema" xmlns:xs="http://www.w3.org/2001/XMLSchema" xmlns:p="http://schemas.microsoft.com/office/2006/metadata/properties" xmlns:ns2="c340dd69-6dcb-4f68-be59-83f5ced86ed4" targetNamespace="http://schemas.microsoft.com/office/2006/metadata/properties" ma:root="true" ma:fieldsID="23e29cfcd205adb239cf41a2b6866d76" ns2:_="">
     <xsd:import namespace="c340dd69-6dcb-4f68-be59-83f5ced86ed4"/>
@@ -17481,6 +17565,21 @@
 </ct:contentTypeSchema>
 </file>
 
+<file path=customXml/item3.xml><?xml version="1.0" encoding="utf-8"?>
+<go:gDocsCustomXmlDataStorage xmlns:go="http://customooxmlschemas.google.com/" xmlns:r="http://schemas.openxmlformats.org/officeDocument/2006/relationships">
+  <go:docsCustomData xmlns:go="http://customooxmlschemas.google.com/" roundtripDataSignature="AMtx7mi9hMm1w2n+Vt6hN/m6X//z+ToJ7Q==">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</go:docsCustomData>
+</go:gDocsCustomXmlDataStorage>
+</file>
+
+<file path=customXml/item4.xml><?xml version="1.0" encoding="utf-8"?>
+<?mso-contentType ?>
+<FormTemplates xmlns="http://schemas.microsoft.com/sharepoint/v3/contenttype/forms">
+  <Display>DocumentLibraryForm</Display>
+  <Edit>DocumentLibraryForm</Edit>
+  <New>DocumentLibraryForm</New>
+</FormTemplates>
+</file>
+
 <file path=customXml/item5.xml><?xml version="1.0" encoding="utf-8"?>
 <b:Sources xmlns:b="http://schemas.openxmlformats.org/officeDocument/2006/bibliography" xmlns="http://schemas.openxmlformats.org/officeDocument/2006/bibliography" SelectedStyle="\APASixthEditionOfficeOnline.xsl" StyleName="APA" Version="6">
   <b:Source>
@@ -17501,7 +17600,7 @@
     </b:Author>
     <b:JournalName>Generic Journal</b:JournalName>
     <b:Pages>50-62</b:Pages>
-    <b:RefOrder>1</b:RefOrder>
+    <b:RefOrder>2</b:RefOrder>
   </b:Source>
   <b:Source>
     <b:Tag>Purnd</b:Tag>
@@ -17515,7 +17614,7 @@
     </b:Author>
     <b:InternetSiteTitle>APA Formatting and Style Guide (7th Edition) - Purdue OWL</b:InternetSiteTitle>
     <b:URL>https://owl.purdue.edu/owl/research_and_citation/apa_style/apa_formatting_and_style_guide/index.html</b:URL>
-    <b:RefOrder>2</b:RefOrder>
+    <b:RefOrder>3</b:RefOrder>
   </b:Source>
   <b:Source>
     <b:Tag>Scr22</b:Tag>
@@ -17532,7 +17631,7 @@
     <b:Month>December</b:Month>
     <b:Day>21</b:Day>
     <b:URL>https://www.scribbr.com/citation/generator/</b:URL>
-    <b:RefOrder>3</b:RefOrder>
+    <b:RefOrder>1</b:RefOrder>
   </b:Source>
 </b:Sources>
 </file>
@@ -17547,23 +17646,6 @@
 </file>
 
 <file path=customXml/itemProps2.xml><?xml version="1.0" encoding="utf-8"?>
-<ds:datastoreItem xmlns:ds="http://schemas.openxmlformats.org/officeDocument/2006/customXml" ds:itemID="{038ECA9E-3AC2-4841-9944-C2555DB6A71C}">
-  <ds:schemaRefs>
-    <ds:schemaRef ds:uri="http://schemas.microsoft.com/sharepoint/v3/contenttype/forms"/>
-  </ds:schemaRefs>
-</ds:datastoreItem>
-</file>
-
-<file path=customXml/itemProps3.xml><?xml version="1.0" encoding="utf-8"?>
-<ds:datastoreItem xmlns:ds="http://schemas.openxmlformats.org/officeDocument/2006/customXml" ds:itemID="{11111111-1234-1234-1234-123412341234}">
-  <ds:schemaRefs>
-    <ds:schemaRef ds:uri="http://customooxmlschemas.google.com/"/>
-    <ds:schemaRef ds:uri="http://schemas.openxmlformats.org/officeDocument/2006/relationships"/>
-  </ds:schemaRefs>
-</ds:datastoreItem>
-</file>
-
-<file path=customXml/itemProps4.xml><?xml version="1.0" encoding="utf-8"?>
 <ds:datastoreItem xmlns:ds="http://schemas.openxmlformats.org/officeDocument/2006/customXml" ds:itemID="{E429DB93-14AE-4639-A78D-C7BE2E7BAD01}">
   <ds:schemaRefs>
     <ds:schemaRef ds:uri="http://schemas.microsoft.com/office/2006/metadata/contentType"/>
@@ -17581,8 +17663,25 @@
 </ds:datastoreItem>
 </file>
 
+<file path=customXml/itemProps3.xml><?xml version="1.0" encoding="utf-8"?>
+<ds:datastoreItem xmlns:ds="http://schemas.openxmlformats.org/officeDocument/2006/customXml" ds:itemID="{11111111-1234-1234-1234-123412341234}">
+  <ds:schemaRefs>
+    <ds:schemaRef ds:uri="http://customooxmlschemas.google.com/"/>
+    <ds:schemaRef ds:uri="http://schemas.openxmlformats.org/officeDocument/2006/relationships"/>
+  </ds:schemaRefs>
+</ds:datastoreItem>
+</file>
+
+<file path=customXml/itemProps4.xml><?xml version="1.0" encoding="utf-8"?>
+<ds:datastoreItem xmlns:ds="http://schemas.openxmlformats.org/officeDocument/2006/customXml" ds:itemID="{038ECA9E-3AC2-4841-9944-C2555DB6A71C}">
+  <ds:schemaRefs>
+    <ds:schemaRef ds:uri="http://schemas.microsoft.com/sharepoint/v3/contenttype/forms"/>
+  </ds:schemaRefs>
+</ds:datastoreItem>
+</file>
+
 <file path=customXml/itemProps5.xml><?xml version="1.0" encoding="utf-8"?>
-<ds:datastoreItem xmlns:ds="http://schemas.openxmlformats.org/officeDocument/2006/customXml" ds:itemID="{119407D8-7FC4-47F1-85AD-0300064F059B}">
+<ds:datastoreItem xmlns:ds="http://schemas.openxmlformats.org/officeDocument/2006/customXml" ds:itemID="{040FBB43-0208-466E-8B9F-70AB988AAE50}">
   <ds:schemaRefs>
     <ds:schemaRef ds:uri="http://schemas.openxmlformats.org/officeDocument/2006/bibliography"/>
   </ds:schemaRefs>

</xml_diff>